<commit_message>
Pa la Legavy V3
</commit_message>
<xml_diff>
--- a/FASE 7 & OPTIMIZACIÓN.docx
+++ b/FASE 7 & OPTIMIZACIÓN.docx
@@ -6,6 +6,1520 @@
       <w:pPr>
         <w:rPr>
           <w:rFonts w:ascii="Segoe UI Emoji" w:hAnsi="Segoe UI Emoji" w:cs="Segoe UI Emoji"/>
+          <w:b/>
+          <w:bCs/>
+        </w:rPr>
+      </w:pPr>
+      <w:r>
+        <w:rPr>
+          <w:rFonts w:ascii="Segoe UI Emoji" w:hAnsi="Segoe UI Emoji" w:cs="Segoe UI Emoji"/>
+          <w:b/>
+          <w:bCs/>
+        </w:rPr>
+        <w:t>🛡️ GRUPO 1: Seguridad e Integridad de Datos (Prioridad CRÍTICA)</w:t>
+      </w:r>
+    </w:p>
+    <w:p>
+      <w:pPr>
+        <w:rPr>
+          <w:rFonts w:ascii="Segoe UI Emoji" w:hAnsi="Segoe UI Emoji" w:cs="Segoe UI Emoji"/>
+          <w:b/>
+          <w:bCs/>
+        </w:rPr>
+      </w:pPr>
+      <w:r>
+        <w:rPr>
+          <w:rFonts w:ascii="Segoe UI Emoji" w:hAnsi="Segoe UI Emoji" w:cs="Segoe UI Emoji"/>
+          <w:b/>
+          <w:bCs/>
+          <w:i/>
+          <w:iCs/>
+        </w:rPr>
+        <w:t>Debe hacerse primero. Un sistema no puede operar si filtra datos de otros clientes o acepta facturas duplicadas.</w:t>
+      </w:r>
+    </w:p>
+    <w:p>
+      <w:pPr>
+        <w:numPr>
+          <w:ilvl w:val="0"/>
+          <w:numId w:val="5"/>
+        </w:numPr>
+        <w:rPr>
+          <w:rFonts w:ascii="Segoe UI Emoji" w:hAnsi="Segoe UI Emoji" w:cs="Segoe UI Emoji"/>
+          <w:b/>
+          <w:bCs/>
+        </w:rPr>
+      </w:pPr>
+      <w:r>
+        <w:rPr>
+          <w:rFonts w:ascii="Segoe UI Emoji" w:hAnsi="Segoe UI Emoji" w:cs="Segoe UI Emoji"/>
+          <w:b/>
+          <w:bCs/>
+        </w:rPr>
+        <w:t xml:space="preserve">(Más Fácil) Restringir Buscador de Clientes para B2B (Punto 6): Ocultar o deshabilitar la búsqueda AJAX en el </w:t>
+      </w:r>
+      <w:proofErr w:type="spellStart"/>
+      <w:r>
+        <w:rPr>
+          <w:rFonts w:ascii="Segoe UI Emoji" w:hAnsi="Segoe UI Emoji" w:cs="Segoe UI Emoji"/>
+          <w:b/>
+          <w:bCs/>
+        </w:rPr>
+        <w:t>cotizador</w:t>
+      </w:r>
+      <w:proofErr w:type="spellEnd"/>
+      <w:r>
+        <w:rPr>
+          <w:rFonts w:ascii="Segoe UI Emoji" w:hAnsi="Segoe UI Emoji" w:cs="Segoe UI Emoji"/>
+          <w:b/>
+          <w:bCs/>
+        </w:rPr>
+        <w:t xml:space="preserve"> si el usuario tiene el </w:t>
+      </w:r>
+      <w:proofErr w:type="spellStart"/>
+      <w:r>
+        <w:rPr>
+          <w:rFonts w:ascii="Segoe UI Emoji" w:hAnsi="Segoe UI Emoji" w:cs="Segoe UI Emoji"/>
+          <w:b/>
+          <w:bCs/>
+        </w:rPr>
+        <w:t>flag</w:t>
+      </w:r>
+      <w:proofErr w:type="spellEnd"/>
+      <w:r>
+        <w:rPr>
+          <w:rFonts w:ascii="Segoe UI Emoji" w:hAnsi="Segoe UI Emoji" w:cs="Segoe UI Emoji"/>
+          <w:b/>
+          <w:bCs/>
+        </w:rPr>
+        <w:t xml:space="preserve"> is_b2b. Solo podrán crear clientes nuevos.</w:t>
+      </w:r>
+    </w:p>
+    <w:p>
+      <w:pPr>
+        <w:numPr>
+          <w:ilvl w:val="0"/>
+          <w:numId w:val="5"/>
+        </w:numPr>
+        <w:rPr>
+          <w:rFonts w:ascii="Segoe UI Emoji" w:hAnsi="Segoe UI Emoji" w:cs="Segoe UI Emoji"/>
+          <w:b/>
+          <w:bCs/>
+        </w:rPr>
+      </w:pPr>
+      <w:r>
+        <w:rPr>
+          <w:rFonts w:ascii="Segoe UI Emoji" w:hAnsi="Segoe UI Emoji" w:cs="Segoe UI Emoji"/>
+          <w:b/>
+          <w:bCs/>
+        </w:rPr>
+        <w:t xml:space="preserve">(Fácil) Fijar Prefijo </w:t>
+      </w:r>
+      <w:proofErr w:type="spellStart"/>
+      <w:r>
+        <w:rPr>
+          <w:rFonts w:ascii="Segoe UI Emoji" w:hAnsi="Segoe UI Emoji" w:cs="Segoe UI Emoji"/>
+          <w:b/>
+          <w:bCs/>
+        </w:rPr>
+        <w:t>Loyverse</w:t>
+      </w:r>
+      <w:proofErr w:type="spellEnd"/>
+      <w:r>
+        <w:rPr>
+          <w:rFonts w:ascii="Segoe UI Emoji" w:hAnsi="Segoe UI Emoji" w:cs="Segoe UI Emoji"/>
+          <w:b/>
+          <w:bCs/>
+        </w:rPr>
+        <w:t xml:space="preserve"> (Punto 7b): Modificar el HTML del modal de pago para dejar únicamente la opción "L" en el selector de prefijos de factura.</w:t>
+      </w:r>
+    </w:p>
+    <w:p>
+      <w:pPr>
+        <w:numPr>
+          <w:ilvl w:val="0"/>
+          <w:numId w:val="5"/>
+        </w:numPr>
+        <w:rPr>
+          <w:rFonts w:ascii="Segoe UI Emoji" w:hAnsi="Segoe UI Emoji" w:cs="Segoe UI Emoji"/>
+          <w:b/>
+          <w:bCs/>
+        </w:rPr>
+      </w:pPr>
+      <w:r>
+        <w:rPr>
+          <w:rFonts w:ascii="Segoe UI Emoji" w:hAnsi="Segoe UI Emoji" w:cs="Segoe UI Emoji"/>
+          <w:b/>
+          <w:bCs/>
+        </w:rPr>
+        <w:t xml:space="preserve">(Medio) Bloqueo de Facturas Duplicadas (Punto 7a): Agregar una validación en el </w:t>
+      </w:r>
+      <w:proofErr w:type="spellStart"/>
+      <w:r>
+        <w:rPr>
+          <w:rFonts w:ascii="Segoe UI Emoji" w:hAnsi="Segoe UI Emoji" w:cs="Segoe UI Emoji"/>
+          <w:b/>
+          <w:bCs/>
+        </w:rPr>
+        <w:t>backend</w:t>
+      </w:r>
+      <w:proofErr w:type="spellEnd"/>
+      <w:r>
+        <w:rPr>
+          <w:rFonts w:ascii="Segoe UI Emoji" w:hAnsi="Segoe UI Emoji" w:cs="Segoe UI Emoji"/>
+          <w:b/>
+          <w:bCs/>
+        </w:rPr>
+        <w:t xml:space="preserve"> (PHP) antes de cambiar el estado a "Pagado" que busque en la base de datos si el número de </w:t>
+      </w:r>
+      <w:proofErr w:type="spellStart"/>
+      <w:r>
+        <w:rPr>
+          <w:rFonts w:ascii="Segoe UI Emoji" w:hAnsi="Segoe UI Emoji" w:cs="Segoe UI Emoji"/>
+          <w:b/>
+          <w:bCs/>
+        </w:rPr>
+        <w:t>Loyverse</w:t>
+      </w:r>
+      <w:proofErr w:type="spellEnd"/>
+      <w:r>
+        <w:rPr>
+          <w:rFonts w:ascii="Segoe UI Emoji" w:hAnsi="Segoe UI Emoji" w:cs="Segoe UI Emoji"/>
+          <w:b/>
+          <w:bCs/>
+        </w:rPr>
+        <w:t xml:space="preserve"> ya existe, bloqueando la acción si es positivo.</w:t>
+      </w:r>
+    </w:p>
+    <w:p>
+      <w:pPr>
+        <w:numPr>
+          <w:ilvl w:val="0"/>
+          <w:numId w:val="5"/>
+        </w:numPr>
+        <w:rPr>
+          <w:rFonts w:ascii="Segoe UI Emoji" w:hAnsi="Segoe UI Emoji" w:cs="Segoe UI Emoji"/>
+          <w:b/>
+          <w:bCs/>
+        </w:rPr>
+      </w:pPr>
+      <w:r>
+        <w:rPr>
+          <w:rFonts w:ascii="Segoe UI Emoji" w:hAnsi="Segoe UI Emoji" w:cs="Segoe UI Emoji"/>
+          <w:b/>
+          <w:bCs/>
+        </w:rPr>
+        <w:t xml:space="preserve">(Medio) Fuga de Datos al Clonar Cotización (Punto 11): Modificar el </w:t>
+      </w:r>
+      <w:proofErr w:type="spellStart"/>
+      <w:r>
+        <w:rPr>
+          <w:rFonts w:ascii="Segoe UI Emoji" w:hAnsi="Segoe UI Emoji" w:cs="Segoe UI Emoji"/>
+          <w:b/>
+          <w:bCs/>
+        </w:rPr>
+        <w:t>endpoint</w:t>
+      </w:r>
+      <w:proofErr w:type="spellEnd"/>
+      <w:r>
+        <w:rPr>
+          <w:rFonts w:ascii="Segoe UI Emoji" w:hAnsi="Segoe UI Emoji" w:cs="Segoe UI Emoji"/>
+          <w:b/>
+          <w:bCs/>
+        </w:rPr>
+        <w:t xml:space="preserve"> </w:t>
+      </w:r>
+      <w:proofErr w:type="spellStart"/>
+      <w:r>
+        <w:rPr>
+          <w:rFonts w:ascii="Segoe UI Emoji" w:hAnsi="Segoe UI Emoji" w:cs="Segoe UI Emoji"/>
+          <w:b/>
+          <w:bCs/>
+        </w:rPr>
+        <w:t>suite_get_quote_details_ajax</w:t>
+      </w:r>
+      <w:proofErr w:type="spellEnd"/>
+      <w:r>
+        <w:rPr>
+          <w:rFonts w:ascii="Segoe UI Emoji" w:hAnsi="Segoe UI Emoji" w:cs="Segoe UI Emoji"/>
+          <w:b/>
+          <w:bCs/>
+        </w:rPr>
+        <w:t xml:space="preserve">. Si el vendedor que clona no es el dueño original del cliente (ej. el cliente J000 es de la base principal), el sistema debe enviar los datos de la cotización, pero </w:t>
+      </w:r>
+      <w:r>
+        <w:rPr>
+          <w:rFonts w:ascii="Segoe UI Emoji" w:hAnsi="Segoe UI Emoji" w:cs="Segoe UI Emoji"/>
+          <w:b/>
+          <w:bCs/>
+          <w:i/>
+          <w:iCs/>
+        </w:rPr>
+        <w:t>vaciar</w:t>
+      </w:r>
+      <w:r>
+        <w:rPr>
+          <w:rFonts w:ascii="Segoe UI Emoji" w:hAnsi="Segoe UI Emoji" w:cs="Segoe UI Emoji"/>
+          <w:b/>
+          <w:bCs/>
+        </w:rPr>
+        <w:t xml:space="preserve"> u ocultar los datos personales del cliente en el JSON de respuesta.</w:t>
+      </w:r>
+    </w:p>
+    <w:p>
+      <w:pPr>
+        <w:rPr>
+          <w:rFonts w:ascii="Segoe UI Emoji" w:hAnsi="Segoe UI Emoji" w:cs="Segoe UI Emoji"/>
+          <w:b/>
+          <w:bCs/>
+        </w:rPr>
+      </w:pPr>
+      <w:r>
+        <w:rPr>
+          <w:rFonts w:ascii="Segoe UI Emoji" w:hAnsi="Segoe UI Emoji" w:cs="Segoe UI Emoji"/>
+          <w:b/>
+          <w:bCs/>
+        </w:rPr>
+        <w:pict w14:anchorId="45145D33">
+          <v:rect id="_x0000_i1045" style="width:0;height:1.5pt" o:hralign="center" o:hrstd="t" o:hr="t" fillcolor="#a0a0a0" stroked="f"/>
+        </w:pict>
+      </w:r>
+    </w:p>
+    <w:p>
+      <w:pPr>
+        <w:rPr>
+          <w:rFonts w:ascii="Segoe UI Emoji" w:hAnsi="Segoe UI Emoji" w:cs="Segoe UI Emoji"/>
+          <w:b/>
+          <w:bCs/>
+        </w:rPr>
+      </w:pPr>
+      <w:r>
+        <w:rPr>
+          <w:rFonts w:ascii="Segoe UI Emoji" w:hAnsi="Segoe UI Emoji" w:cs="Segoe UI Emoji"/>
+          <w:b/>
+          <w:bCs/>
+        </w:rPr>
+        <w:t>🐛 GRUPO 2: Reparación de Bugs y Lógica Contable (Prioridad ALTA)</w:t>
+      </w:r>
+    </w:p>
+    <w:p>
+      <w:pPr>
+        <w:rPr>
+          <w:rFonts w:ascii="Segoe UI Emoji" w:hAnsi="Segoe UI Emoji" w:cs="Segoe UI Emoji"/>
+          <w:b/>
+          <w:bCs/>
+        </w:rPr>
+      </w:pPr>
+      <w:r>
+        <w:rPr>
+          <w:rFonts w:ascii="Segoe UI Emoji" w:hAnsi="Segoe UI Emoji" w:cs="Segoe UI Emoji"/>
+          <w:b/>
+          <w:bCs/>
+          <w:i/>
+          <w:iCs/>
+        </w:rPr>
+        <w:t xml:space="preserve">Correcciones sobre módulos que ya </w:t>
+      </w:r>
+      <w:proofErr w:type="gramStart"/>
+      <w:r>
+        <w:rPr>
+          <w:rFonts w:ascii="Segoe UI Emoji" w:hAnsi="Segoe UI Emoji" w:cs="Segoe UI Emoji"/>
+          <w:b/>
+          <w:bCs/>
+          <w:i/>
+          <w:iCs/>
+        </w:rPr>
+        <w:t>existen</w:t>
+      </w:r>
+      <w:proofErr w:type="gramEnd"/>
+      <w:r>
+        <w:rPr>
+          <w:rFonts w:ascii="Segoe UI Emoji" w:hAnsi="Segoe UI Emoji" w:cs="Segoe UI Emoji"/>
+          <w:b/>
+          <w:bCs/>
+          <w:i/>
+          <w:iCs/>
+        </w:rPr>
+        <w:t xml:space="preserve"> pero no están mostrando la data correcta.</w:t>
+      </w:r>
+    </w:p>
+    <w:p>
+      <w:pPr>
+        <w:numPr>
+          <w:ilvl w:val="0"/>
+          <w:numId w:val="6"/>
+        </w:numPr>
+        <w:rPr>
+          <w:rFonts w:ascii="Segoe UI Emoji" w:hAnsi="Segoe UI Emoji" w:cs="Segoe UI Emoji"/>
+          <w:b/>
+          <w:bCs/>
+        </w:rPr>
+      </w:pPr>
+      <w:r>
+        <w:rPr>
+          <w:rFonts w:ascii="Segoe UI Emoji" w:hAnsi="Segoe UI Emoji" w:cs="Segoe UI Emoji"/>
+          <w:b/>
+          <w:bCs/>
+        </w:rPr>
+        <w:t xml:space="preserve">(Fácil) Mostrar </w:t>
+      </w:r>
+      <w:proofErr w:type="spellStart"/>
+      <w:r>
+        <w:rPr>
+          <w:rFonts w:ascii="Segoe UI Emoji" w:hAnsi="Segoe UI Emoji" w:cs="Segoe UI Emoji"/>
+          <w:b/>
+          <w:bCs/>
+        </w:rPr>
+        <w:t>IDs</w:t>
+      </w:r>
+      <w:proofErr w:type="spellEnd"/>
+      <w:r>
+        <w:rPr>
+          <w:rFonts w:ascii="Segoe UI Emoji" w:hAnsi="Segoe UI Emoji" w:cs="Segoe UI Emoji"/>
+          <w:b/>
+          <w:bCs/>
+        </w:rPr>
+        <w:t xml:space="preserve"> en Bonos y Premios (Puntos 4 y 5): Modificar el JavaScript de </w:t>
+      </w:r>
+      <w:proofErr w:type="spellStart"/>
+      <w:r>
+        <w:rPr>
+          <w:rFonts w:ascii="Segoe UI Emoji" w:hAnsi="Segoe UI Emoji" w:cs="Segoe UI Emoji"/>
+          <w:b/>
+          <w:bCs/>
+        </w:rPr>
+        <w:t>DataTables</w:t>
+      </w:r>
+      <w:proofErr w:type="spellEnd"/>
+      <w:r>
+        <w:rPr>
+          <w:rFonts w:ascii="Segoe UI Emoji" w:hAnsi="Segoe UI Emoji" w:cs="Segoe UI Emoji"/>
+          <w:b/>
+          <w:bCs/>
+        </w:rPr>
+        <w:t xml:space="preserve"> y el SQL del Ledger para que, en lugar de mostrar el texto estático "Premio/Bono/Abono", imprima el id real de esa transacción en la base de datos.</w:t>
+      </w:r>
+    </w:p>
+    <w:p>
+      <w:pPr>
+        <w:numPr>
+          <w:ilvl w:val="0"/>
+          <w:numId w:val="6"/>
+        </w:numPr>
+        <w:rPr>
+          <w:rFonts w:ascii="Segoe UI Emoji" w:hAnsi="Segoe UI Emoji" w:cs="Segoe UI Emoji"/>
+          <w:b/>
+          <w:bCs/>
+        </w:rPr>
+      </w:pPr>
+      <w:r>
+        <w:rPr>
+          <w:rFonts w:ascii="Segoe UI Emoji" w:hAnsi="Segoe UI Emoji" w:cs="Segoe UI Emoji"/>
+          <w:b/>
+          <w:bCs/>
+        </w:rPr>
+        <w:t xml:space="preserve">(Fácil) Tabla Ledger B2B Vacía (Puntos 9 y 10): Reparar la consulta SQL (WHERE) en el </w:t>
+      </w:r>
+      <w:proofErr w:type="spellStart"/>
+      <w:r>
+        <w:rPr>
+          <w:rFonts w:ascii="Segoe UI Emoji" w:hAnsi="Segoe UI Emoji" w:cs="Segoe UI Emoji"/>
+          <w:b/>
+          <w:bCs/>
+        </w:rPr>
+        <w:t>endpoint</w:t>
+      </w:r>
+      <w:proofErr w:type="spellEnd"/>
+      <w:r>
+        <w:rPr>
+          <w:rFonts w:ascii="Segoe UI Emoji" w:hAnsi="Segoe UI Emoji" w:cs="Segoe UI Emoji"/>
+          <w:b/>
+          <w:bCs/>
+        </w:rPr>
+        <w:t xml:space="preserve"> de auditoría. Seguramente la consulta está buscando a los B2B como empleados regulares y por eso devuelve 0 registros, a pesar de que la venta existe.</w:t>
+      </w:r>
+    </w:p>
+    <w:p>
+      <w:pPr>
+        <w:numPr>
+          <w:ilvl w:val="0"/>
+          <w:numId w:val="6"/>
+        </w:numPr>
+        <w:rPr>
+          <w:rFonts w:ascii="Segoe UI Emoji" w:hAnsi="Segoe UI Emoji" w:cs="Segoe UI Emoji"/>
+          <w:b/>
+          <w:bCs/>
+        </w:rPr>
+      </w:pPr>
+      <w:r>
+        <w:rPr>
+          <w:rFonts w:ascii="Segoe UI Emoji" w:hAnsi="Segoe UI Emoji" w:cs="Segoe UI Emoji"/>
+          <w:b/>
+          <w:bCs/>
+        </w:rPr>
+        <w:t xml:space="preserve">(Fácil) Bug del Ranking de Comisiones (Punto 1): Corregir la consulta matemática del "Pez Gordo" y "Deja </w:t>
+      </w:r>
+      <w:proofErr w:type="spellStart"/>
+      <w:r>
+        <w:rPr>
+          <w:rFonts w:ascii="Segoe UI Emoji" w:hAnsi="Segoe UI Emoji" w:cs="Segoe UI Emoji"/>
+          <w:b/>
+          <w:bCs/>
+        </w:rPr>
+        <w:t>pa</w:t>
+      </w:r>
+      <w:proofErr w:type="spellEnd"/>
+      <w:r>
+        <w:rPr>
+          <w:rFonts w:ascii="Segoe UI Emoji" w:hAnsi="Segoe UI Emoji" w:cs="Segoe UI Emoji"/>
+          <w:b/>
+          <w:bCs/>
+        </w:rPr>
+        <w:t xml:space="preserve"> los demás". Actualmente, parece que solo suma las cotizaciones en estado "pendiente". Hay que decirle al SQL que sume tanto las "pendientes" como las "pagadas" dentro del mes en curso.</w:t>
+      </w:r>
+    </w:p>
+    <w:p>
+      <w:pPr>
+        <w:numPr>
+          <w:ilvl w:val="0"/>
+          <w:numId w:val="6"/>
+        </w:numPr>
+        <w:rPr>
+          <w:rFonts w:ascii="Segoe UI Emoji" w:hAnsi="Segoe UI Emoji" w:cs="Segoe UI Emoji"/>
+          <w:b/>
+          <w:bCs/>
+        </w:rPr>
+      </w:pPr>
+      <w:r>
+        <w:rPr>
+          <w:rFonts w:ascii="Segoe UI Emoji" w:hAnsi="Segoe UI Emoji" w:cs="Segoe UI Emoji"/>
+          <w:b/>
+          <w:bCs/>
+        </w:rPr>
+        <w:t xml:space="preserve">(Medio) Suma Algebraica de Negativos/Devoluciones (Punto 2b y Nota Técnica): Ajustar la función matemática de cierre de mes y el Ledger para que </w:t>
+      </w:r>
+      <w:proofErr w:type="gramStart"/>
+      <w:r>
+        <w:rPr>
+          <w:rFonts w:ascii="Segoe UI Emoji" w:hAnsi="Segoe UI Emoji" w:cs="Segoe UI Emoji"/>
+          <w:b/>
+          <w:bCs/>
+        </w:rPr>
+        <w:t>SUM(</w:t>
+      </w:r>
+      <w:proofErr w:type="gramEnd"/>
+      <w:r>
+        <w:rPr>
+          <w:rFonts w:ascii="Segoe UI Emoji" w:hAnsi="Segoe UI Emoji" w:cs="Segoe UI Emoji"/>
+          <w:b/>
+          <w:bCs/>
+        </w:rPr>
+        <w:t>comisiones) reste automáticamente los valores negativos generados por la Logística Inversa (Anulados) antes de mostrar el balance disponible.</w:t>
+      </w:r>
+    </w:p>
+    <w:p>
+      <w:pPr>
+        <w:rPr>
+          <w:rFonts w:ascii="Segoe UI Emoji" w:hAnsi="Segoe UI Emoji" w:cs="Segoe UI Emoji"/>
+          <w:b/>
+          <w:bCs/>
+        </w:rPr>
+      </w:pPr>
+    </w:p>
+    <w:p>
+      <w:pPr>
+        <w:rPr>
+          <w:rFonts w:ascii="Segoe UI Emoji" w:hAnsi="Segoe UI Emoji" w:cs="Segoe UI Emoji"/>
+          <w:b/>
+          <w:bCs/>
+        </w:rPr>
+      </w:pPr>
+    </w:p>
+    <w:p>
+      <w:pPr>
+        <w:rPr>
+          <w:rFonts w:ascii="Segoe UI Emoji" w:hAnsi="Segoe UI Emoji" w:cs="Segoe UI Emoji"/>
+          <w:b/>
+          <w:bCs/>
+        </w:rPr>
+      </w:pPr>
+      <w:r>
+        <w:rPr>
+          <w:rFonts w:ascii="Segoe UI Emoji" w:hAnsi="Segoe UI Emoji" w:cs="Segoe UI Emoji"/>
+          <w:b/>
+          <w:bCs/>
+        </w:rPr>
+        <w:lastRenderedPageBreak/>
+        <w:pict w14:anchorId="394833F6">
+          <v:rect id="_x0000_i1046" style="width:0;height:1.5pt" o:hralign="center" o:hrstd="t" o:hr="t" fillcolor="#a0a0a0" stroked="f"/>
+        </w:pict>
+      </w:r>
+    </w:p>
+    <w:p>
+      <w:pPr>
+        <w:rPr>
+          <w:rFonts w:ascii="Segoe UI Emoji" w:hAnsi="Segoe UI Emoji" w:cs="Segoe UI Emoji"/>
+          <w:b/>
+          <w:bCs/>
+        </w:rPr>
+      </w:pPr>
+      <w:r>
+        <w:rPr>
+          <w:rFonts w:ascii="Segoe UI Emoji" w:hAnsi="Segoe UI Emoji" w:cs="Segoe UI Emoji"/>
+          <w:b/>
+          <w:bCs/>
+        </w:rPr>
+        <w:t>⚙️ GRUPO 3: Automatización y Configuración Core (Prioridad MEDIA)</w:t>
+      </w:r>
+    </w:p>
+    <w:p>
+      <w:pPr>
+        <w:rPr>
+          <w:rFonts w:ascii="Segoe UI Emoji" w:hAnsi="Segoe UI Emoji" w:cs="Segoe UI Emoji"/>
+          <w:b/>
+          <w:bCs/>
+        </w:rPr>
+      </w:pPr>
+      <w:r>
+        <w:rPr>
+          <w:rFonts w:ascii="Segoe UI Emoji" w:hAnsi="Segoe UI Emoji" w:cs="Segoe UI Emoji"/>
+          <w:b/>
+          <w:bCs/>
+          <w:i/>
+          <w:iCs/>
+        </w:rPr>
+        <w:t>Mejoras "bajo el capó" para sincronizar la información y los permisos.</w:t>
+      </w:r>
+    </w:p>
+    <w:p>
+      <w:pPr>
+        <w:numPr>
+          <w:ilvl w:val="0"/>
+          <w:numId w:val="7"/>
+        </w:numPr>
+        <w:rPr>
+          <w:rFonts w:ascii="Segoe UI Emoji" w:hAnsi="Segoe UI Emoji" w:cs="Segoe UI Emoji"/>
+          <w:b/>
+          <w:bCs/>
+        </w:rPr>
+      </w:pPr>
+      <w:r>
+        <w:rPr>
+          <w:rFonts w:ascii="Segoe UI Emoji" w:hAnsi="Segoe UI Emoji" w:cs="Segoe UI Emoji"/>
+          <w:b/>
+          <w:bCs/>
+        </w:rPr>
+        <w:t xml:space="preserve">(Fácil) Switch de Participación en Comisiones (Punto 8): Ya habíamos agregado un </w:t>
+      </w:r>
+      <w:proofErr w:type="spellStart"/>
+      <w:r>
+        <w:rPr>
+          <w:rFonts w:ascii="Segoe UI Emoji" w:hAnsi="Segoe UI Emoji" w:cs="Segoe UI Emoji"/>
+          <w:b/>
+          <w:bCs/>
+        </w:rPr>
+        <w:t>checkbox</w:t>
+      </w:r>
+      <w:proofErr w:type="spellEnd"/>
+      <w:r>
+        <w:rPr>
+          <w:rFonts w:ascii="Segoe UI Emoji" w:hAnsi="Segoe UI Emoji" w:cs="Segoe UI Emoji"/>
+          <w:b/>
+          <w:bCs/>
+        </w:rPr>
+        <w:t xml:space="preserve"> visual para esto. Solo necesitamos asegurarnos de que la consulta del </w:t>
+      </w:r>
+      <w:proofErr w:type="spellStart"/>
+      <w:r>
+        <w:rPr>
+          <w:rFonts w:ascii="Segoe UI Emoji" w:hAnsi="Segoe UI Emoji" w:cs="Segoe UI Emoji"/>
+          <w:b/>
+          <w:bCs/>
+        </w:rPr>
+        <w:t>Dashboard</w:t>
+      </w:r>
+      <w:proofErr w:type="spellEnd"/>
+      <w:r>
+        <w:rPr>
+          <w:rFonts w:ascii="Segoe UI Emoji" w:hAnsi="Segoe UI Emoji" w:cs="Segoe UI Emoji"/>
+          <w:b/>
+          <w:bCs/>
+        </w:rPr>
+        <w:t xml:space="preserve"> excluya matemáticamente a los vendedores que tengan este switch apagado.</w:t>
+      </w:r>
+    </w:p>
+    <w:p>
+      <w:pPr>
+        <w:numPr>
+          <w:ilvl w:val="0"/>
+          <w:numId w:val="7"/>
+        </w:numPr>
+        <w:rPr>
+          <w:rFonts w:ascii="Segoe UI Emoji" w:hAnsi="Segoe UI Emoji" w:cs="Segoe UI Emoji"/>
+          <w:b/>
+          <w:bCs/>
+        </w:rPr>
+      </w:pPr>
+      <w:r>
+        <w:rPr>
+          <w:rFonts w:ascii="Segoe UI Emoji" w:hAnsi="Segoe UI Emoji" w:cs="Segoe UI Emoji"/>
+          <w:b/>
+          <w:bCs/>
+        </w:rPr>
+        <w:t>(Medio) Sincronización de CSV y Cron Jobs (Plan Fase 6): Actualizar el script de Python para incluir inventario.csv y configurar el Cron Job de WordPress para que se dispare en las horas pares (10:00 a 18:00).</w:t>
+      </w:r>
+    </w:p>
+    <w:p>
+      <w:pPr>
+        <w:rPr>
+          <w:rFonts w:ascii="Segoe UI Emoji" w:hAnsi="Segoe UI Emoji" w:cs="Segoe UI Emoji"/>
+          <w:b/>
+          <w:bCs/>
+        </w:rPr>
+      </w:pPr>
+      <w:r>
+        <w:rPr>
+          <w:rFonts w:ascii="Segoe UI Emoji" w:hAnsi="Segoe UI Emoji" w:cs="Segoe UI Emoji"/>
+          <w:b/>
+          <w:bCs/>
+        </w:rPr>
+        <w:pict w14:anchorId="21FE3451">
+          <v:rect id="_x0000_i1047" style="width:0;height:1.5pt" o:hralign="center" o:hrstd="t" o:hr="t" fillcolor="#a0a0a0" stroked="f"/>
+        </w:pict>
+      </w:r>
+    </w:p>
+    <w:p>
+      <w:pPr>
+        <w:rPr>
+          <w:rFonts w:ascii="Segoe UI Emoji" w:hAnsi="Segoe UI Emoji" w:cs="Segoe UI Emoji"/>
+          <w:b/>
+          <w:bCs/>
+        </w:rPr>
+      </w:pPr>
+      <w:r>
+        <w:rPr>
+          <w:rFonts w:ascii="Segoe UI Emoji" w:hAnsi="Segoe UI Emoji" w:cs="Segoe UI Emoji"/>
+          <w:b/>
+          <w:bCs/>
+        </w:rPr>
+        <w:t>🚀 GRUPO 4: Nuevas Vistas y Reportes Avanzados (Prioridad BAJA / Mayor Esfuerzo)</w:t>
+      </w:r>
+    </w:p>
+    <w:p>
+      <w:pPr>
+        <w:rPr>
+          <w:rFonts w:ascii="Segoe UI Emoji" w:hAnsi="Segoe UI Emoji" w:cs="Segoe UI Emoji"/>
+          <w:b/>
+          <w:bCs/>
+        </w:rPr>
+      </w:pPr>
+      <w:r>
+        <w:rPr>
+          <w:rFonts w:ascii="Segoe UI Emoji" w:hAnsi="Segoe UI Emoji" w:cs="Segoe UI Emoji"/>
+          <w:b/>
+          <w:bCs/>
+          <w:i/>
+          <w:iCs/>
+        </w:rPr>
+        <w:t>Son características maravillosas, pero se deben construir solo cuando la base (Grupos 1, 2 y 3) esté impecable.</w:t>
+      </w:r>
+    </w:p>
+    <w:p>
+      <w:pPr>
+        <w:numPr>
+          <w:ilvl w:val="0"/>
+          <w:numId w:val="8"/>
+        </w:numPr>
+        <w:rPr>
+          <w:rFonts w:ascii="Segoe UI Emoji" w:hAnsi="Segoe UI Emoji" w:cs="Segoe UI Emoji"/>
+          <w:b/>
+          <w:bCs/>
+        </w:rPr>
+      </w:pPr>
+      <w:r>
+        <w:rPr>
+          <w:rFonts w:ascii="Segoe UI Emoji" w:hAnsi="Segoe UI Emoji" w:cs="Segoe UI Emoji"/>
+          <w:b/>
+          <w:bCs/>
+        </w:rPr>
+        <w:t xml:space="preserve">(Medio) Nueva Pestaña: Ranking Global (Punto 3): Crear una </w:t>
+      </w:r>
+      <w:proofErr w:type="spellStart"/>
+      <w:r>
+        <w:rPr>
+          <w:rFonts w:ascii="Segoe UI Emoji" w:hAnsi="Segoe UI Emoji" w:cs="Segoe UI Emoji"/>
+          <w:b/>
+          <w:bCs/>
+        </w:rPr>
+        <w:t>sub-pestaña</w:t>
+      </w:r>
+      <w:proofErr w:type="spellEnd"/>
+      <w:r>
+        <w:rPr>
+          <w:rFonts w:ascii="Segoe UI Emoji" w:hAnsi="Segoe UI Emoji" w:cs="Segoe UI Emoji"/>
+          <w:b/>
+          <w:bCs/>
+        </w:rPr>
+        <w:t xml:space="preserve"> visual y un </w:t>
+      </w:r>
+      <w:proofErr w:type="spellStart"/>
+      <w:r>
+        <w:rPr>
+          <w:rFonts w:ascii="Segoe UI Emoji" w:hAnsi="Segoe UI Emoji" w:cs="Segoe UI Emoji"/>
+          <w:b/>
+          <w:bCs/>
+        </w:rPr>
+        <w:t>endpoint</w:t>
+      </w:r>
+      <w:proofErr w:type="spellEnd"/>
+      <w:r>
+        <w:rPr>
+          <w:rFonts w:ascii="Segoe UI Emoji" w:hAnsi="Segoe UI Emoji" w:cs="Segoe UI Emoji"/>
+          <w:b/>
+          <w:bCs/>
+        </w:rPr>
+        <w:t xml:space="preserve"> PHP que haga un SELECT general de todos los vendedores (sin importar RLS) y los ordene por monto ($) y por volumen (cantidad), mostrándolo en dos tablas.</w:t>
+      </w:r>
+    </w:p>
+    <w:p>
+      <w:pPr>
+        <w:numPr>
+          <w:ilvl w:val="0"/>
+          <w:numId w:val="8"/>
+        </w:numPr>
+        <w:rPr>
+          <w:rFonts w:ascii="Segoe UI Emoji" w:hAnsi="Segoe UI Emoji" w:cs="Segoe UI Emoji"/>
+          <w:b/>
+          <w:bCs/>
+        </w:rPr>
+      </w:pPr>
+      <w:r>
+        <w:rPr>
+          <w:rFonts w:ascii="Segoe UI Emoji" w:hAnsi="Segoe UI Emoji" w:cs="Segoe UI Emoji"/>
+          <w:b/>
+          <w:bCs/>
+        </w:rPr>
+        <w:t xml:space="preserve">(Difícil) Autenticación 2FA (Plan Fase 6): Instalar e interceptar un plugin de 2FA (o desarrollarlo) para integrarlo con los modales SweetAlert2 al momento del </w:t>
+      </w:r>
+      <w:proofErr w:type="spellStart"/>
+      <w:r>
+        <w:rPr>
+          <w:rFonts w:ascii="Segoe UI Emoji" w:hAnsi="Segoe UI Emoji" w:cs="Segoe UI Emoji"/>
+          <w:b/>
+          <w:bCs/>
+        </w:rPr>
+        <w:t>login</w:t>
+      </w:r>
+      <w:proofErr w:type="spellEnd"/>
+      <w:r>
+        <w:rPr>
+          <w:rFonts w:ascii="Segoe UI Emoji" w:hAnsi="Segoe UI Emoji" w:cs="Segoe UI Emoji"/>
+          <w:b/>
+          <w:bCs/>
+        </w:rPr>
+        <w:t xml:space="preserve">, obligando al uso de Google </w:t>
+      </w:r>
+      <w:proofErr w:type="spellStart"/>
+      <w:r>
+        <w:rPr>
+          <w:rFonts w:ascii="Segoe UI Emoji" w:hAnsi="Segoe UI Emoji" w:cs="Segoe UI Emoji"/>
+          <w:b/>
+          <w:bCs/>
+        </w:rPr>
+        <w:t>Authenticator</w:t>
+      </w:r>
+      <w:proofErr w:type="spellEnd"/>
+      <w:r>
+        <w:rPr>
+          <w:rFonts w:ascii="Segoe UI Emoji" w:hAnsi="Segoe UI Emoji" w:cs="Segoe UI Emoji"/>
+          <w:b/>
+          <w:bCs/>
+        </w:rPr>
+        <w:t>.</w:t>
+      </w:r>
+    </w:p>
+    <w:p>
+      <w:pPr>
+        <w:numPr>
+          <w:ilvl w:val="0"/>
+          <w:numId w:val="8"/>
+        </w:numPr>
+        <w:rPr>
+          <w:rFonts w:ascii="Segoe UI Emoji" w:hAnsi="Segoe UI Emoji" w:cs="Segoe UI Emoji"/>
+          <w:b/>
+          <w:bCs/>
+        </w:rPr>
+      </w:pPr>
+      <w:r>
+        <w:rPr>
+          <w:rFonts w:ascii="Segoe UI Emoji" w:hAnsi="Segoe UI Emoji" w:cs="Segoe UI Emoji"/>
+          <w:b/>
+          <w:bCs/>
+        </w:rPr>
+        <w:t xml:space="preserve">(Muy Difícil) Nueva Pestaña: Reportes PDF y </w:t>
+      </w:r>
+      <w:proofErr w:type="spellStart"/>
+      <w:r>
+        <w:rPr>
+          <w:rFonts w:ascii="Segoe UI Emoji" w:hAnsi="Segoe UI Emoji" w:cs="Segoe UI Emoji"/>
+          <w:b/>
+          <w:bCs/>
+        </w:rPr>
+        <w:t>Dashboard</w:t>
+      </w:r>
+      <w:proofErr w:type="spellEnd"/>
+      <w:r>
+        <w:rPr>
+          <w:rFonts w:ascii="Segoe UI Emoji" w:hAnsi="Segoe UI Emoji" w:cs="Segoe UI Emoji"/>
+          <w:b/>
+          <w:bCs/>
+        </w:rPr>
+        <w:t xml:space="preserve"> Financiero (Punto 2a y 2c): Este es un </w:t>
+      </w:r>
+      <w:proofErr w:type="spellStart"/>
+      <w:r>
+        <w:rPr>
+          <w:rFonts w:ascii="Segoe UI Emoji" w:hAnsi="Segoe UI Emoji" w:cs="Segoe UI Emoji"/>
+          <w:b/>
+          <w:bCs/>
+        </w:rPr>
+        <w:t>mini-proyecto</w:t>
+      </w:r>
+      <w:proofErr w:type="spellEnd"/>
+      <w:r>
+        <w:rPr>
+          <w:rFonts w:ascii="Segoe UI Emoji" w:hAnsi="Segoe UI Emoji" w:cs="Segoe UI Emoji"/>
+          <w:b/>
+          <w:bCs/>
+        </w:rPr>
+        <w:t xml:space="preserve"> en sí mismo. Requiere:</w:t>
+      </w:r>
+    </w:p>
+    <w:p>
+      <w:pPr>
+        <w:numPr>
+          <w:ilvl w:val="1"/>
+          <w:numId w:val="8"/>
+        </w:numPr>
+        <w:rPr>
+          <w:rFonts w:ascii="Segoe UI Emoji" w:hAnsi="Segoe UI Emoji" w:cs="Segoe UI Emoji"/>
+          <w:b/>
+          <w:bCs/>
+        </w:rPr>
+      </w:pPr>
+      <w:r>
+        <w:rPr>
+          <w:rFonts w:ascii="Segoe UI Emoji" w:hAnsi="Segoe UI Emoji" w:cs="Segoe UI Emoji"/>
+          <w:b/>
+          <w:bCs/>
+        </w:rPr>
+        <w:t>Una nueva vista UI con un selector de vendedor/B2B y selector de mes.</w:t>
+      </w:r>
+    </w:p>
+    <w:p>
+      <w:pPr>
+        <w:numPr>
+          <w:ilvl w:val="1"/>
+          <w:numId w:val="8"/>
+        </w:numPr>
+        <w:rPr>
+          <w:rFonts w:ascii="Segoe UI Emoji" w:hAnsi="Segoe UI Emoji" w:cs="Segoe UI Emoji"/>
+          <w:b/>
+          <w:bCs/>
+        </w:rPr>
+      </w:pPr>
+      <w:r>
+        <w:rPr>
+          <w:rFonts w:ascii="Segoe UI Emoji" w:hAnsi="Segoe UI Emoji" w:cs="Segoe UI Emoji"/>
+          <w:b/>
+          <w:bCs/>
+        </w:rPr>
+        <w:t xml:space="preserve">Un </w:t>
+      </w:r>
+      <w:proofErr w:type="spellStart"/>
+      <w:r>
+        <w:rPr>
+          <w:rFonts w:ascii="Segoe UI Emoji" w:hAnsi="Segoe UI Emoji" w:cs="Segoe UI Emoji"/>
+          <w:b/>
+          <w:bCs/>
+        </w:rPr>
+        <w:t>Dashboard</w:t>
+      </w:r>
+      <w:proofErr w:type="spellEnd"/>
+      <w:r>
+        <w:rPr>
+          <w:rFonts w:ascii="Segoe UI Emoji" w:hAnsi="Segoe UI Emoji" w:cs="Segoe UI Emoji"/>
+          <w:b/>
+          <w:bCs/>
+        </w:rPr>
+        <w:t xml:space="preserve"> general de cuentas por cobrar/pagar.</w:t>
+      </w:r>
+    </w:p>
+    <w:p>
+      <w:pPr>
+        <w:numPr>
+          <w:ilvl w:val="1"/>
+          <w:numId w:val="8"/>
+        </w:numPr>
+        <w:rPr>
+          <w:rFonts w:ascii="Segoe UI Emoji" w:hAnsi="Segoe UI Emoji" w:cs="Segoe UI Emoji"/>
+          <w:b/>
+          <w:bCs/>
+        </w:rPr>
+      </w:pPr>
+      <w:r>
+        <w:rPr>
+          <w:rFonts w:ascii="Segoe UI Emoji" w:hAnsi="Segoe UI Emoji" w:cs="Segoe UI Emoji"/>
+          <w:b/>
+          <w:bCs/>
+        </w:rPr>
+        <w:t>Integrar una librería de PHP (como TCPDF o FPDF) para compilar al vuelo los datos inmutables del mes, generar un PDF estructurado (incluyendo positivos y anulados/negativos) y forzar su descarga.</w:t>
+      </w:r>
+    </w:p>
+    <w:p>
+      <w:pPr>
+        <w:rPr>
+          <w:rFonts w:ascii="Segoe UI Emoji" w:hAnsi="Segoe UI Emoji" w:cs="Segoe UI Emoji"/>
+          <w:b/>
+          <w:bCs/>
+        </w:rPr>
+      </w:pPr>
+    </w:p>
+    <w:p>
+      <w:pPr>
+        <w:rPr>
+          <w:rFonts w:ascii="Times New Roman" w:hAnsi="Times New Roman" w:cs="Times New Roman"/>
+          <w:b/>
+          <w:bCs/>
+        </w:rPr>
+      </w:pPr>
+    </w:p>
+    <w:p>
+      <w:pPr>
+        <w:rPr>
+          <w:rFonts w:ascii="Times New Roman" w:hAnsi="Times New Roman" w:cs="Times New Roman"/>
+          <w:b/>
+          <w:bCs/>
+        </w:rPr>
+      </w:pPr>
+    </w:p>
+    <w:p>
+      <w:pPr>
+        <w:rPr>
+          <w:rFonts w:ascii="Times New Roman" w:hAnsi="Times New Roman" w:cs="Times New Roman"/>
+          <w:b/>
+          <w:bCs/>
+        </w:rPr>
+      </w:pPr>
+    </w:p>
+    <w:p>
+      <w:pPr>
+        <w:rPr>
+          <w:rFonts w:ascii="Times New Roman" w:hAnsi="Times New Roman" w:cs="Times New Roman"/>
+          <w:b/>
+          <w:bCs/>
+        </w:rPr>
+      </w:pPr>
+    </w:p>
+    <w:p>
+      <w:pPr>
+        <w:rPr>
+          <w:rFonts w:ascii="Times New Roman" w:hAnsi="Times New Roman" w:cs="Times New Roman"/>
+          <w:b/>
+          <w:bCs/>
+        </w:rPr>
+      </w:pPr>
+    </w:p>
+    <w:p>
+      <w:pPr>
+        <w:rPr>
+          <w:rFonts w:ascii="Times New Roman" w:hAnsi="Times New Roman" w:cs="Times New Roman"/>
+          <w:b/>
+          <w:bCs/>
+        </w:rPr>
+      </w:pPr>
+    </w:p>
+    <w:p>
+      <w:pPr>
+        <w:rPr>
+          <w:rFonts w:ascii="Times New Roman" w:hAnsi="Times New Roman" w:cs="Times New Roman"/>
+          <w:b/>
+          <w:bCs/>
+        </w:rPr>
+      </w:pPr>
+    </w:p>
+    <w:p>
+      <w:pPr>
+        <w:rPr>
+          <w:rFonts w:ascii="Times New Roman" w:hAnsi="Times New Roman" w:cs="Times New Roman"/>
+          <w:b/>
+          <w:bCs/>
+        </w:rPr>
+      </w:pPr>
+    </w:p>
+    <w:p>
+      <w:pPr>
+        <w:rPr>
+          <w:rFonts w:ascii="Times New Roman" w:hAnsi="Times New Roman" w:cs="Times New Roman"/>
+          <w:b/>
+          <w:bCs/>
+        </w:rPr>
+      </w:pPr>
+    </w:p>
+    <w:p>
+      <w:pPr>
+        <w:rPr>
+          <w:rFonts w:ascii="Times New Roman" w:hAnsi="Times New Roman" w:cs="Times New Roman"/>
+          <w:b/>
+          <w:bCs/>
+        </w:rPr>
+      </w:pPr>
+    </w:p>
+    <w:p>
+      <w:pPr>
+        <w:rPr>
+          <w:rFonts w:ascii="Times New Roman" w:hAnsi="Times New Roman" w:cs="Times New Roman"/>
+          <w:b/>
+          <w:bCs/>
+        </w:rPr>
+      </w:pPr>
+    </w:p>
+    <w:p>
+      <w:pPr>
+        <w:rPr>
+          <w:rFonts w:ascii="Times New Roman" w:hAnsi="Times New Roman" w:cs="Times New Roman"/>
+          <w:b/>
+          <w:bCs/>
+        </w:rPr>
+      </w:pPr>
+    </w:p>
+    <w:p>
+      <w:pPr>
+        <w:rPr>
+          <w:rFonts w:ascii="Times New Roman" w:hAnsi="Times New Roman" w:cs="Times New Roman"/>
+          <w:b/>
+          <w:bCs/>
+        </w:rPr>
+      </w:pPr>
+    </w:p>
+    <w:p>
+      <w:pPr>
+        <w:rPr>
+          <w:rFonts w:ascii="Times New Roman" w:hAnsi="Times New Roman" w:cs="Times New Roman"/>
+          <w:b/>
+          <w:bCs/>
+        </w:rPr>
+      </w:pPr>
+    </w:p>
+    <w:p>
+      <w:pPr>
+        <w:rPr>
+          <w:rFonts w:ascii="Times New Roman" w:hAnsi="Times New Roman" w:cs="Times New Roman"/>
+          <w:b/>
+          <w:bCs/>
+        </w:rPr>
+      </w:pPr>
+    </w:p>
+    <w:p>
+      <w:pPr>
+        <w:rPr>
+          <w:rFonts w:ascii="Times New Roman" w:hAnsi="Times New Roman" w:cs="Times New Roman"/>
+          <w:b/>
+          <w:bCs/>
+        </w:rPr>
+      </w:pPr>
+    </w:p>
+    <w:p>
+      <w:pPr>
+        <w:rPr>
+          <w:rFonts w:ascii="Times New Roman" w:hAnsi="Times New Roman" w:cs="Times New Roman"/>
+          <w:b/>
+          <w:bCs/>
+        </w:rPr>
+      </w:pPr>
+    </w:p>
+    <w:p>
+      <w:pPr>
+        <w:rPr>
+          <w:rFonts w:ascii="Times New Roman" w:hAnsi="Times New Roman" w:cs="Times New Roman"/>
+          <w:b/>
+          <w:bCs/>
+        </w:rPr>
+      </w:pPr>
+    </w:p>
+    <w:p>
+      <w:pPr>
+        <w:rPr>
+          <w:rFonts w:ascii="Times New Roman" w:hAnsi="Times New Roman" w:cs="Times New Roman"/>
+          <w:b/>
+          <w:bCs/>
+        </w:rPr>
+      </w:pPr>
+    </w:p>
+    <w:p>
+      <w:pPr>
+        <w:rPr>
+          <w:rFonts w:ascii="Times New Roman" w:hAnsi="Times New Roman" w:cs="Times New Roman"/>
+          <w:b/>
+          <w:bCs/>
+        </w:rPr>
+      </w:pPr>
+    </w:p>
+    <w:p>
+      <w:pPr>
+        <w:rPr>
+          <w:rFonts w:ascii="Times New Roman" w:hAnsi="Times New Roman" w:cs="Times New Roman"/>
+          <w:b/>
+          <w:bCs/>
+        </w:rPr>
+      </w:pPr>
+    </w:p>
+    <w:p>
+      <w:pPr>
+        <w:rPr>
+          <w:rFonts w:ascii="Times New Roman" w:hAnsi="Times New Roman" w:cs="Times New Roman"/>
+          <w:b/>
+          <w:bCs/>
+        </w:rPr>
+      </w:pPr>
+    </w:p>
+    <w:p>
+      <w:pPr>
+        <w:rPr>
+          <w:rFonts w:ascii="Times New Roman" w:hAnsi="Times New Roman" w:cs="Times New Roman"/>
+          <w:b/>
+          <w:bCs/>
+        </w:rPr>
+      </w:pPr>
+    </w:p>
+    <w:p>
+      <w:pPr>
+        <w:rPr>
+          <w:rFonts w:ascii="Times New Roman" w:hAnsi="Times New Roman" w:cs="Times New Roman"/>
+          <w:b/>
+          <w:bCs/>
+        </w:rPr>
+      </w:pPr>
+    </w:p>
+    <w:p>
+      <w:pPr>
+        <w:rPr>
+          <w:rFonts w:ascii="Times New Roman" w:hAnsi="Times New Roman" w:cs="Times New Roman"/>
+          <w:b/>
+          <w:bCs/>
+        </w:rPr>
+      </w:pPr>
+    </w:p>
+    <w:p>
+      <w:pPr>
+        <w:rPr>
+          <w:rFonts w:ascii="Times New Roman" w:hAnsi="Times New Roman" w:cs="Times New Roman"/>
+          <w:b/>
+          <w:bCs/>
+        </w:rPr>
+      </w:pPr>
+    </w:p>
+    <w:p>
+      <w:pPr>
+        <w:rPr>
+          <w:rFonts w:ascii="Times New Roman" w:hAnsi="Times New Roman" w:cs="Times New Roman"/>
+          <w:b/>
+          <w:bCs/>
+        </w:rPr>
+      </w:pPr>
+    </w:p>
+    <w:p>
+      <w:pPr>
+        <w:rPr>
+          <w:rFonts w:ascii="Times New Roman" w:hAnsi="Times New Roman" w:cs="Times New Roman"/>
+          <w:b/>
+          <w:bCs/>
+        </w:rPr>
+      </w:pPr>
+    </w:p>
+    <w:p>
+      <w:pPr>
+        <w:rPr>
+          <w:rFonts w:ascii="Times New Roman" w:hAnsi="Times New Roman" w:cs="Times New Roman"/>
+          <w:b/>
+          <w:bCs/>
+        </w:rPr>
+      </w:pPr>
+    </w:p>
+    <w:p>
+      <w:pPr>
+        <w:rPr>
+          <w:rFonts w:ascii="Times New Roman" w:hAnsi="Times New Roman" w:cs="Times New Roman"/>
+          <w:b/>
+          <w:bCs/>
+        </w:rPr>
+      </w:pPr>
+    </w:p>
+    <w:p>
+      <w:pPr>
+        <w:rPr>
+          <w:rFonts w:ascii="Times New Roman" w:hAnsi="Times New Roman" w:cs="Times New Roman"/>
+          <w:b/>
+          <w:bCs/>
+        </w:rPr>
+      </w:pPr>
+    </w:p>
+    <w:p>
+      <w:pPr>
+        <w:rPr>
+          <w:rFonts w:ascii="Times New Roman" w:hAnsi="Times New Roman" w:cs="Times New Roman"/>
+          <w:b/>
+          <w:bCs/>
+        </w:rPr>
+      </w:pPr>
+    </w:p>
+    <w:p>
+      <w:pPr>
+        <w:rPr>
+          <w:rFonts w:ascii="Times New Roman" w:hAnsi="Times New Roman" w:cs="Times New Roman"/>
+          <w:b/>
+          <w:bCs/>
+        </w:rPr>
+      </w:pPr>
+    </w:p>
+    <w:p>
+      <w:pPr>
+        <w:rPr>
+          <w:rFonts w:ascii="Times New Roman" w:hAnsi="Times New Roman" w:cs="Times New Roman"/>
+          <w:b/>
+          <w:bCs/>
+        </w:rPr>
+      </w:pPr>
+    </w:p>
+    <w:p>
+      <w:pPr>
+        <w:rPr>
+          <w:rFonts w:ascii="Times New Roman" w:hAnsi="Times New Roman" w:cs="Times New Roman"/>
+          <w:b/>
+          <w:bCs/>
+        </w:rPr>
+      </w:pPr>
+    </w:p>
+    <w:p>
+      <w:pPr>
+        <w:rPr>
+          <w:rFonts w:ascii="Times New Roman" w:hAnsi="Times New Roman" w:cs="Times New Roman"/>
+          <w:b/>
+          <w:bCs/>
+        </w:rPr>
+      </w:pPr>
+    </w:p>
+    <w:p>
+      <w:pPr>
+        <w:rPr>
+          <w:rFonts w:ascii="Times New Roman" w:hAnsi="Times New Roman" w:cs="Times New Roman"/>
+          <w:b/>
+          <w:bCs/>
+        </w:rPr>
+      </w:pPr>
+    </w:p>
+    <w:p>
+      <w:pPr>
+        <w:rPr>
+          <w:rFonts w:ascii="Times New Roman" w:hAnsi="Times New Roman" w:cs="Times New Roman"/>
+          <w:b/>
+          <w:bCs/>
+        </w:rPr>
+      </w:pPr>
+    </w:p>
+    <w:p>
+      <w:pPr>
+        <w:rPr>
+          <w:rFonts w:ascii="Times New Roman" w:hAnsi="Times New Roman" w:cs="Times New Roman"/>
+          <w:b/>
+          <w:bCs/>
+        </w:rPr>
+      </w:pPr>
+    </w:p>
+    <w:p>
+      <w:pPr>
+        <w:rPr>
+          <w:rFonts w:ascii="Times New Roman" w:hAnsi="Times New Roman" w:cs="Times New Roman"/>
+          <w:b/>
+          <w:bCs/>
+        </w:rPr>
+      </w:pPr>
+    </w:p>
+    <w:p>
+      <w:pPr>
+        <w:rPr>
+          <w:rFonts w:ascii="Times New Roman" w:hAnsi="Times New Roman" w:cs="Times New Roman"/>
+          <w:b/>
+          <w:bCs/>
+        </w:rPr>
+      </w:pPr>
+    </w:p>
+    <w:p>
+      <w:pPr>
+        <w:rPr>
+          <w:rFonts w:ascii="Times New Roman" w:hAnsi="Times New Roman" w:cs="Times New Roman"/>
+          <w:b/>
+          <w:bCs/>
+        </w:rPr>
+      </w:pPr>
+    </w:p>
+    <w:p>
+      <w:pPr>
+        <w:rPr>
+          <w:rFonts w:ascii="Times New Roman" w:hAnsi="Times New Roman" w:cs="Times New Roman"/>
+          <w:b/>
+          <w:bCs/>
+        </w:rPr>
+      </w:pPr>
+    </w:p>
+    <w:p>
+      <w:pPr>
+        <w:rPr>
+          <w:rFonts w:ascii="Times New Roman" w:hAnsi="Times New Roman" w:cs="Times New Roman"/>
+          <w:b/>
+          <w:bCs/>
+        </w:rPr>
+      </w:pPr>
+    </w:p>
+    <w:p>
+      <w:pPr>
+        <w:rPr>
+          <w:rFonts w:ascii="Times New Roman" w:hAnsi="Times New Roman" w:cs="Times New Roman"/>
+          <w:b/>
+          <w:bCs/>
+        </w:rPr>
+      </w:pPr>
+    </w:p>
+    <w:p>
+      <w:pPr>
+        <w:rPr>
+          <w:rFonts w:ascii="Times New Roman" w:hAnsi="Times New Roman" w:cs="Times New Roman"/>
+          <w:b/>
+          <w:bCs/>
+        </w:rPr>
+      </w:pPr>
+    </w:p>
+    <w:p>
+      <w:pPr>
+        <w:rPr>
+          <w:rFonts w:ascii="Times New Roman" w:hAnsi="Times New Roman" w:cs="Times New Roman"/>
+          <w:b/>
+          <w:bCs/>
+        </w:rPr>
+      </w:pPr>
+    </w:p>
+    <w:p>
+      <w:pPr>
+        <w:rPr>
+          <w:rFonts w:ascii="Times New Roman" w:hAnsi="Times New Roman" w:cs="Times New Roman"/>
+          <w:b/>
+          <w:bCs/>
+        </w:rPr>
+      </w:pPr>
+    </w:p>
+    <w:p>
+      <w:pPr>
+        <w:rPr>
+          <w:rFonts w:ascii="Times New Roman" w:hAnsi="Times New Roman" w:cs="Times New Roman"/>
+          <w:b/>
+          <w:bCs/>
+        </w:rPr>
+      </w:pPr>
+    </w:p>
+    <w:p>
+      <w:pPr>
+        <w:rPr>
+          <w:rFonts w:ascii="Times New Roman" w:hAnsi="Times New Roman" w:cs="Times New Roman"/>
+          <w:b/>
+          <w:bCs/>
+        </w:rPr>
+      </w:pPr>
+    </w:p>
+    <w:p>
+      <w:pPr>
+        <w:rPr>
+          <w:rFonts w:ascii="Times New Roman" w:hAnsi="Times New Roman" w:cs="Times New Roman"/>
+          <w:b/>
+          <w:bCs/>
+        </w:rPr>
+      </w:pPr>
+    </w:p>
+    <w:p>
+      <w:pPr>
+        <w:rPr>
+          <w:rFonts w:ascii="Times New Roman" w:hAnsi="Times New Roman" w:cs="Times New Roman"/>
+          <w:b/>
+          <w:bCs/>
+        </w:rPr>
+      </w:pPr>
+    </w:p>
+    <w:p>
+      <w:pPr>
+        <w:rPr>
+          <w:rFonts w:ascii="Times New Roman" w:hAnsi="Times New Roman" w:cs="Times New Roman"/>
+          <w:b/>
+          <w:bCs/>
+        </w:rPr>
+      </w:pPr>
+    </w:p>
+    <w:p>
+      <w:pPr>
+        <w:rPr>
+          <w:rFonts w:ascii="Times New Roman" w:hAnsi="Times New Roman" w:cs="Times New Roman"/>
+          <w:b/>
+          <w:bCs/>
+        </w:rPr>
+      </w:pPr>
+    </w:p>
+    <w:p>
+      <w:pPr>
+        <w:rPr>
+          <w:rFonts w:ascii="Times New Roman" w:hAnsi="Times New Roman" w:cs="Times New Roman"/>
+          <w:b/>
+          <w:bCs/>
+        </w:rPr>
+      </w:pPr>
+    </w:p>
+    <w:p>
+      <w:pPr>
+        <w:rPr>
+          <w:rFonts w:ascii="Times New Roman" w:hAnsi="Times New Roman" w:cs="Times New Roman"/>
+          <w:b/>
+          <w:bCs/>
+        </w:rPr>
+      </w:pPr>
+    </w:p>
+    <w:p>
+      <w:pPr>
+        <w:rPr>
+          <w:rFonts w:ascii="Times New Roman" w:hAnsi="Times New Roman" w:cs="Times New Roman"/>
+          <w:b/>
+          <w:bCs/>
+        </w:rPr>
+      </w:pPr>
+    </w:p>
+    <w:p>
+      <w:pPr>
+        <w:rPr>
+          <w:rFonts w:ascii="Times New Roman" w:hAnsi="Times New Roman" w:cs="Times New Roman"/>
+          <w:b/>
+          <w:bCs/>
+        </w:rPr>
+      </w:pPr>
+    </w:p>
+    <w:p>
+      <w:pPr>
+        <w:rPr>
+          <w:rFonts w:ascii="Times New Roman" w:hAnsi="Times New Roman" w:cs="Times New Roman"/>
+          <w:b/>
+          <w:bCs/>
+        </w:rPr>
+      </w:pPr>
+    </w:p>
+    <w:p>
+      <w:pPr>
+        <w:rPr>
+          <w:rFonts w:ascii="Times New Roman" w:hAnsi="Times New Roman" w:cs="Times New Roman"/>
           <w:b/>
           <w:bCs/>
         </w:rPr>
@@ -96,7 +1610,22 @@
         <w:rPr>
           <w:rFonts w:ascii="Times New Roman" w:hAnsi="Times New Roman" w:cs="Times New Roman"/>
         </w:rPr>
-        <w:t>Al anular una venta de algún vendedor aparece en el sistema como Anulado y en rojo, me gusta. Sin embargo hay un detalle, y es que no veo los negativos de sus cuentas en relación a los anulados. Recomiendo agregar una 4 sub pestana disponible para el administrados u otro perfil con el permiso que contenga:</w:t>
+        <w:lastRenderedPageBreak/>
+        <w:t xml:space="preserve">Al anular una venta de algún vendedor aparece en el sistema como Anulado y en rojo, me gusta. Sin </w:t>
+      </w:r>
+      <w:proofErr w:type="gramStart"/>
+      <w:r>
+        <w:rPr>
+          <w:rFonts w:ascii="Times New Roman" w:hAnsi="Times New Roman" w:cs="Times New Roman"/>
+        </w:rPr>
+        <w:t>embargo</w:t>
+      </w:r>
+      <w:proofErr w:type="gramEnd"/>
+      <w:r>
+        <w:rPr>
+          <w:rFonts w:ascii="Times New Roman" w:hAnsi="Times New Roman" w:cs="Times New Roman"/>
+        </w:rPr>
+        <w:t xml:space="preserve"> hay un detalle, y es que no veo los negativos de sus cuentas en relación a los anulados. Recomiendo agregar una 4 sub pestana disponible para el administrados u otro perfil con el permiso que contenga:</w:t>
       </w:r>
       <w:r>
         <w:rPr>
@@ -137,6 +1666,7 @@
         <w:t xml:space="preserve">, estos deben ser inmutables. En dichos </w:t>
       </w:r>
       <w:proofErr w:type="spellStart"/>
+      <w:proofErr w:type="gramStart"/>
       <w:r>
         <w:rPr>
           <w:rFonts w:ascii="Times New Roman" w:hAnsi="Times New Roman" w:cs="Times New Roman"/>
@@ -148,13 +1678,62 @@
         <w:rPr>
           <w:rFonts w:ascii="Times New Roman" w:hAnsi="Times New Roman" w:cs="Times New Roman"/>
         </w:rPr>
-        <w:t xml:space="preserve"> , por ejemplo en el cierre de Enero , vamos a tener los registros del vendedor seleccionado “X” y </w:t>
-      </w:r>
-      <w:r>
-        <w:rPr>
-          <w:rFonts w:ascii="Times New Roman" w:hAnsi="Times New Roman" w:cs="Times New Roman"/>
-        </w:rPr>
-        <w:t xml:space="preserve">se pueden apreciar sus datos de vendedor, sus registros y al final de todo , un balance de dinero, anulados, comisiones, total, etc. Debe incluir el periodo de forma </w:t>
+        <w:t xml:space="preserve"> ,</w:t>
+      </w:r>
+      <w:proofErr w:type="gramEnd"/>
+      <w:r>
+        <w:rPr>
+          <w:rFonts w:ascii="Times New Roman" w:hAnsi="Times New Roman" w:cs="Times New Roman"/>
+        </w:rPr>
+        <w:t xml:space="preserve"> por </w:t>
+      </w:r>
+      <w:proofErr w:type="gramStart"/>
+      <w:r>
+        <w:rPr>
+          <w:rFonts w:ascii="Times New Roman" w:hAnsi="Times New Roman" w:cs="Times New Roman"/>
+        </w:rPr>
+        <w:t>ejemplo</w:t>
+      </w:r>
+      <w:proofErr w:type="gramEnd"/>
+      <w:r>
+        <w:rPr>
+          <w:rFonts w:ascii="Times New Roman" w:hAnsi="Times New Roman" w:cs="Times New Roman"/>
+        </w:rPr>
+        <w:t xml:space="preserve"> en el cierre de </w:t>
+      </w:r>
+      <w:proofErr w:type="gramStart"/>
+      <w:r>
+        <w:rPr>
+          <w:rFonts w:ascii="Times New Roman" w:hAnsi="Times New Roman" w:cs="Times New Roman"/>
+        </w:rPr>
+        <w:t>Enero ,</w:t>
+      </w:r>
+      <w:proofErr w:type="gramEnd"/>
+      <w:r>
+        <w:rPr>
+          <w:rFonts w:ascii="Times New Roman" w:hAnsi="Times New Roman" w:cs="Times New Roman"/>
+        </w:rPr>
+        <w:t xml:space="preserve"> vamos a tener los registros del vendedor seleccionado “X” y </w:t>
+      </w:r>
+      <w:r>
+        <w:rPr>
+          <w:rFonts w:ascii="Times New Roman" w:hAnsi="Times New Roman" w:cs="Times New Roman"/>
+        </w:rPr>
+        <w:t xml:space="preserve">se pueden apreciar sus datos de vendedor, sus registros y al final de </w:t>
+      </w:r>
+      <w:proofErr w:type="gramStart"/>
+      <w:r>
+        <w:rPr>
+          <w:rFonts w:ascii="Times New Roman" w:hAnsi="Times New Roman" w:cs="Times New Roman"/>
+        </w:rPr>
+        <w:t>todo ,</w:t>
+      </w:r>
+      <w:proofErr w:type="gramEnd"/>
+      <w:r>
+        <w:rPr>
+          <w:rFonts w:ascii="Times New Roman" w:hAnsi="Times New Roman" w:cs="Times New Roman"/>
+        </w:rPr>
+        <w:t xml:space="preserve"> un balance de dinero, anulados, comisiones, total, etc. Debe incluir el periodo de forma </w:t>
       </w:r>
       <w:proofErr w:type="spellStart"/>
       <w:r>
@@ -272,7 +1851,49 @@
         <w:rPr>
           <w:rFonts w:ascii="Times New Roman" w:hAnsi="Times New Roman" w:cs="Times New Roman"/>
         </w:rPr>
-        <w:t xml:space="preserve"> de comisiones para que un administrador o un perfil autorizado pueda ver el ranking de todos los vendedores , se debe ordenar de mayor a menor monto total de ventas(Dinero total) , luego otro ranking ordenado por la mayor cantidad de ventas (</w:t>
+        <w:t xml:space="preserve"> de comisiones para que un administrador o un perfil autorizado pueda ver el ranking de todos los </w:t>
+      </w:r>
+      <w:proofErr w:type="gramStart"/>
+      <w:r>
+        <w:rPr>
+          <w:rFonts w:ascii="Times New Roman" w:hAnsi="Times New Roman" w:cs="Times New Roman"/>
+        </w:rPr>
+        <w:t>vendedores ,</w:t>
+      </w:r>
+      <w:proofErr w:type="gramEnd"/>
+      <w:r>
+        <w:rPr>
+          <w:rFonts w:ascii="Times New Roman" w:hAnsi="Times New Roman" w:cs="Times New Roman"/>
+        </w:rPr>
+        <w:t xml:space="preserve"> se debe ordenar de mayor a menor monto total de </w:t>
+      </w:r>
+      <w:proofErr w:type="gramStart"/>
+      <w:r>
+        <w:rPr>
+          <w:rFonts w:ascii="Times New Roman" w:hAnsi="Times New Roman" w:cs="Times New Roman"/>
+        </w:rPr>
+        <w:t>ventas(</w:t>
+      </w:r>
+      <w:proofErr w:type="gramEnd"/>
+      <w:r>
+        <w:rPr>
+          <w:rFonts w:ascii="Times New Roman" w:hAnsi="Times New Roman" w:cs="Times New Roman"/>
+        </w:rPr>
+        <w:t>Dinero total</w:t>
+      </w:r>
+      <w:proofErr w:type="gramStart"/>
+      <w:r>
+        <w:rPr>
+          <w:rFonts w:ascii="Times New Roman" w:hAnsi="Times New Roman" w:cs="Times New Roman"/>
+        </w:rPr>
+        <w:t>) ,</w:t>
+      </w:r>
+      <w:proofErr w:type="gramEnd"/>
+      <w:r>
+        <w:rPr>
+          <w:rFonts w:ascii="Times New Roman" w:hAnsi="Times New Roman" w:cs="Times New Roman"/>
+        </w:rPr>
+        <w:t xml:space="preserve"> luego otro ranking ordenado por la mayor cantidad de ventas (</w:t>
       </w:r>
       <w:proofErr w:type="spellStart"/>
       <w:r>
@@ -286,7 +1907,21 @@
         <w:rPr>
           <w:rFonts w:ascii="Times New Roman" w:hAnsi="Times New Roman" w:cs="Times New Roman"/>
         </w:rPr>
-        <w:t xml:space="preserve"> de ventas) . </w:t>
+        <w:t xml:space="preserve"> de ventas</w:t>
+      </w:r>
+      <w:proofErr w:type="gramStart"/>
+      <w:r>
+        <w:rPr>
+          <w:rFonts w:ascii="Times New Roman" w:hAnsi="Times New Roman" w:cs="Times New Roman"/>
+        </w:rPr>
+        <w:t>) .</w:t>
+      </w:r>
+      <w:proofErr w:type="gramEnd"/>
+      <w:r>
+        <w:rPr>
+          <w:rFonts w:ascii="Times New Roman" w:hAnsi="Times New Roman" w:cs="Times New Roman"/>
+        </w:rPr>
+        <w:t xml:space="preserve"> </w:t>
       </w:r>
       <w:proofErr w:type="spellStart"/>
       <w:r>
@@ -326,7 +1961,21 @@
         <w:rPr>
           <w:rFonts w:ascii="Times New Roman" w:hAnsi="Times New Roman" w:cs="Times New Roman"/>
         </w:rPr>
-        <w:t>El botón de abono funciona perfectamente pero “Premio/Bono/Abono” No tienen un ID. Quiero que se muestre el ID de la operación.</w:t>
+        <w:t xml:space="preserve">El botón de abono funciona </w:t>
+      </w:r>
+      <w:proofErr w:type="gramStart"/>
+      <w:r>
+        <w:rPr>
+          <w:rFonts w:ascii="Times New Roman" w:hAnsi="Times New Roman" w:cs="Times New Roman"/>
+        </w:rPr>
+        <w:t>perfectamente</w:t>
+      </w:r>
+      <w:proofErr w:type="gramEnd"/>
+      <w:r>
+        <w:rPr>
+          <w:rFonts w:ascii="Times New Roman" w:hAnsi="Times New Roman" w:cs="Times New Roman"/>
+        </w:rPr>
+        <w:t xml:space="preserve"> pero “Premio/Bono/Abono” No tienen un ID. Quiero que se muestre el ID de la operación.</w:t>
       </w:r>
     </w:p>
     <w:p>
@@ -362,8 +2011,16 @@
         <w:rPr>
           <w:rFonts w:ascii="Times New Roman" w:hAnsi="Times New Roman" w:cs="Times New Roman"/>
         </w:rPr>
-        <w:t xml:space="preserve"> – DEBO VOLVER A GENERAR PREMIOS PORQUE EL SISTEMA TENIA UN ERROR EN LA BASE DE DATOS- YA LO SOLUCIONE</w:t>
-      </w:r>
+        <w:t xml:space="preserve"> – DEBO VOLVER A GENERAR PREMIOS PORQUE EL SISTEMA TENIA UN ERROR EN LA BASE DE DATOS- YA LO </w:t>
+      </w:r>
+      <w:proofErr w:type="gramStart"/>
+      <w:r>
+        <w:rPr>
+          <w:rFonts w:ascii="Times New Roman" w:hAnsi="Times New Roman" w:cs="Times New Roman"/>
+        </w:rPr>
+        <w:t>SOLUCIONE</w:t>
+      </w:r>
+      <w:proofErr w:type="gramEnd"/>
     </w:p>
     <w:p>
       <w:pPr>
@@ -394,8 +2051,16 @@
         <w:rPr>
           <w:rFonts w:ascii="Times New Roman" w:hAnsi="Times New Roman" w:cs="Times New Roman"/>
         </w:rPr>
-        <w:t>Sus clientes si se guardarían en nuestra base de datos y se comportaría como normalmente lo haría. – Deshabilitar el buscador de clientes .</w:t>
-      </w:r>
+        <w:t xml:space="preserve">Sus clientes si se guardarían en nuestra base de datos y se comportaría como normalmente lo haría. – Deshabilitar el buscador de </w:t>
+      </w:r>
+      <w:proofErr w:type="gramStart"/>
+      <w:r>
+        <w:rPr>
+          <w:rFonts w:ascii="Times New Roman" w:hAnsi="Times New Roman" w:cs="Times New Roman"/>
+        </w:rPr>
+        <w:t>clientes .</w:t>
+      </w:r>
+      <w:proofErr w:type="gramEnd"/>
     </w:p>
     <w:p>
       <w:pPr>
@@ -484,7 +2149,6 @@
         <w:rPr>
           <w:rFonts w:ascii="Times New Roman" w:hAnsi="Times New Roman" w:cs="Times New Roman"/>
         </w:rPr>
-        <w:lastRenderedPageBreak/>
         <w:t xml:space="preserve"> Generar un </w:t>
       </w:r>
       <w:proofErr w:type="spellStart"/>
@@ -611,13 +2275,23 @@
           <w:bCs/>
         </w:rPr>
       </w:pPr>
-      <w:r>
-        <w:rPr>
-          <w:rFonts w:ascii="Times New Roman" w:hAnsi="Times New Roman" w:cs="Times New Roman"/>
-          <w:b/>
-          <w:bCs/>
-        </w:rPr>
-        <w:t>“ cuando el b2b ya ha concretado una venta y se ha registrado correctamente.</w:t>
+      <w:proofErr w:type="gramStart"/>
+      <w:r>
+        <w:rPr>
+          <w:rFonts w:ascii="Times New Roman" w:hAnsi="Times New Roman" w:cs="Times New Roman"/>
+          <w:b/>
+          <w:bCs/>
+        </w:rPr>
+        <w:t>“ cuando</w:t>
+      </w:r>
+      <w:proofErr w:type="gramEnd"/>
+      <w:r>
+        <w:rPr>
+          <w:rFonts w:ascii="Times New Roman" w:hAnsi="Times New Roman" w:cs="Times New Roman"/>
+          <w:b/>
+          <w:bCs/>
+        </w:rPr>
+        <w:t xml:space="preserve"> el b2b ya ha concretado una venta y se ha registrado correctamente.</w:t>
       </w:r>
     </w:p>
     <w:p>
@@ -657,7 +2331,52 @@
           <w:b/>
           <w:bCs/>
         </w:rPr>
-        <w:t xml:space="preserve"> y el historial, se comportan excelentes con la restricción de los registros de los clientes. Me gusta muchísimo porque si ya existía un cliente no se agrega a su base de datos de clientes sino que se mantiene inmutable en la base de datos principal y además el buscador limita la búsqueda a solo los registros que dicho vendedor tiene en la tabla de clientes, sin embargo encontré una forma de ver los datos completos del registro del cliente en la base de datos principal. Si ese vendedor hace una cotización para el </w:t>
+        <w:t xml:space="preserve"> y el historial, se comportan excelentes con la restricción de los registros de los clientes. Me gusta muchísimo porque si ya existía un cliente no se agrega a su base de datos de </w:t>
+      </w:r>
+      <w:proofErr w:type="gramStart"/>
+      <w:r>
+        <w:rPr>
+          <w:rFonts w:ascii="Times New Roman" w:hAnsi="Times New Roman" w:cs="Times New Roman"/>
+          <w:b/>
+          <w:bCs/>
+        </w:rPr>
+        <w:t>clientes</w:t>
+      </w:r>
+      <w:proofErr w:type="gramEnd"/>
+      <w:r>
+        <w:rPr>
+          <w:rFonts w:ascii="Times New Roman" w:hAnsi="Times New Roman" w:cs="Times New Roman"/>
+          <w:b/>
+          <w:bCs/>
+        </w:rPr>
+        <w:t xml:space="preserve"> sino que se mantiene inmutable en la base de datos principal y además el buscador limita la búsqueda a solo los registros que dicho vendedor tiene en la tabla de clientes, sin </w:t>
+      </w:r>
+      <w:proofErr w:type="gramStart"/>
+      <w:r>
+        <w:rPr>
+          <w:rFonts w:ascii="Times New Roman" w:hAnsi="Times New Roman" w:cs="Times New Roman"/>
+          <w:b/>
+          <w:bCs/>
+        </w:rPr>
+        <w:t>embargo</w:t>
+      </w:r>
+      <w:proofErr w:type="gramEnd"/>
+      <w:r>
+        <w:rPr>
+          <w:rFonts w:ascii="Times New Roman" w:hAnsi="Times New Roman" w:cs="Times New Roman"/>
+          <w:b/>
+          <w:bCs/>
+        </w:rPr>
+        <w:t xml:space="preserve"> encontré una forma de ver los datos completos del registro del </w:t>
+      </w:r>
+      <w:r>
+        <w:rPr>
+          <w:rFonts w:ascii="Times New Roman" w:hAnsi="Times New Roman" w:cs="Times New Roman"/>
+          <w:b/>
+          <w:bCs/>
+        </w:rPr>
+        <w:lastRenderedPageBreak/>
+        <w:t xml:space="preserve">cliente en la base de datos principal. Si ese vendedor hace una cotización para el </w:t>
       </w:r>
       <w:proofErr w:type="spellStart"/>
       <w:r>
@@ -675,7 +2394,25 @@
           <w:b/>
           <w:bCs/>
         </w:rPr>
-        <w:t xml:space="preserve"> J000 y ya estaba registrado en la base de datos no se le registra en su tabla de clientes pero si se emite la orden y en el historial le doy a clonar esa cotización aparecerán todos los datos que tenga J000 en la base principal</w:t>
+        <w:t xml:space="preserve"> J000 y ya estaba registrado en la base de datos no se le registra en su tabla de </w:t>
+      </w:r>
+      <w:proofErr w:type="gramStart"/>
+      <w:r>
+        <w:rPr>
+          <w:rFonts w:ascii="Times New Roman" w:hAnsi="Times New Roman" w:cs="Times New Roman"/>
+          <w:b/>
+          <w:bCs/>
+        </w:rPr>
+        <w:t>clientes</w:t>
+      </w:r>
+      <w:proofErr w:type="gramEnd"/>
+      <w:r>
+        <w:rPr>
+          <w:rFonts w:ascii="Times New Roman" w:hAnsi="Times New Roman" w:cs="Times New Roman"/>
+          <w:b/>
+          <w:bCs/>
+        </w:rPr>
+        <w:t xml:space="preserve"> pero si se emite la orden y en el historial le doy a clonar esa cotización aparecerán todos los datos que tenga J000 en la base principal</w:t>
       </w:r>
     </w:p>
     <w:p>
@@ -1005,7 +2742,6 @@
           <w:b/>
           <w:bCs/>
         </w:rPr>
-        <w:lastRenderedPageBreak/>
         <w:t>Nueva Tabla inventario.csv:</w:t>
       </w:r>
     </w:p>
@@ -1051,6 +2787,7 @@
           <w:b/>
           <w:bCs/>
         </w:rPr>
+        <w:lastRenderedPageBreak/>
         <w:t>📝</w:t>
       </w:r>
       <w:r>
@@ -1100,6 +2837,123 @@
 <file path=word/numbering.xml><?xml version="1.0" encoding="utf-8"?>
 <w:numbering xmlns:wpc="http://schemas.microsoft.com/office/word/2010/wordprocessingCanvas" xmlns:cx="http://schemas.microsoft.com/office/drawing/2014/chartex" xmlns:cx1="http://schemas.microsoft.com/office/drawing/2015/9/8/chartex" xmlns:cx2="http://schemas.microsoft.com/office/drawing/2015/10/21/chartex" xmlns:cx3="http://schemas.microsoft.com/office/drawing/2016/5/9/chartex" xmlns:cx4="http://schemas.microsoft.com/office/drawing/2016/5/10/chartex" xmlns:cx5="http://schemas.microsoft.com/office/drawing/2016/5/11/chartex" xmlns:cx6="http://schemas.microsoft.com/office/drawing/2016/5/12/chartex" xmlns:cx7="http://schemas.microsoft.com/office/drawing/2016/5/13/chartex" xmlns:cx8="http://schemas.microsoft.com/office/drawing/2016/5/14/chartex" xmlns:mc="http://schemas.openxmlformats.org/markup-compatibility/2006" xmlns:aink="http://schemas.microsoft.com/office/drawing/2016/ink" xmlns:am3d="http://schemas.microsoft.com/office/drawing/2017/model3d" xmlns:o="urn:schemas-microsoft-com:office:office" xmlns:oel="http://schemas.microsoft.com/office/2019/extlst" xmlns:r="http://schemas.openxmlformats.org/officeDocument/2006/relationships" xmlns:m="http://schemas.openxmlformats.org/officeDocument/2006/math" xmlns:v="urn:schemas-microsoft-com:vml" xmlns:wp14="http://schemas.microsoft.com/office/word/2010/wordprocessingDrawing" xmlns:wp="http://schemas.openxmlformats.org/drawingml/2006/wordprocessingDrawing" xmlns:w10="urn:schemas-microsoft-com:office:word" xmlns:w="http://schemas.openxmlformats.org/wordprocessingml/2006/main" xmlns:w14="http://schemas.microsoft.com/office/word/2010/wordml" xmlns:w15="http://schemas.microsoft.com/office/word/2012/wordml" xmlns:w16cex="http://schemas.microsoft.com/office/word/2018/wordml/cex" xmlns:w16cid="http://schemas.microsoft.com/office/word/2016/wordml/cid" xmlns:w16="http://schemas.microsoft.com/office/word/2018/wordml" xmlns:w16du="http://schemas.microsoft.com/office/word/2023/wordml/word16du" xmlns:w16sdtdh="http://schemas.microsoft.com/office/word/2020/wordml/sdtdatahash" xmlns:w16sdtfl="http://schemas.microsoft.com/office/word/2024/wordml/sdtformatlock" xmlns:w16se="http://schemas.microsoft.com/office/word/2015/wordml/symex" xmlns:wpg="http://schemas.microsoft.com/office/word/2010/wordprocessingGroup" xmlns:wpi="http://schemas.microsoft.com/office/word/2010/wordprocessingInk" xmlns:wne="http://schemas.microsoft.com/office/word/2006/wordml" xmlns:wps="http://schemas.microsoft.com/office/word/2010/wordprocessingShape" mc:Ignorable="w14 w15 w16se w16cid w16 w16cex w16sdtdh w16sdtfl w16du wp14">
   <w:abstractNum w:abstractNumId="0" w15:restartNumberingAfterBreak="0">
+    <w:nsid w:val="162E1580"/>
+    <w:multiLevelType w:val="multilevel"/>
+    <w:tmpl w:val="10F4BE78"/>
+    <w:lvl w:ilvl="0">
+      <w:start w:val="11"/>
+      <w:numFmt w:val="decimal"/>
+      <w:lvlText w:val="%1."/>
+      <w:lvlJc w:val="left"/>
+      <w:pPr>
+        <w:tabs>
+          <w:tab w:val="num" w:pos="720"/>
+        </w:tabs>
+        <w:ind w:left="720" w:hanging="360"/>
+      </w:pPr>
+    </w:lvl>
+    <w:lvl w:ilvl="1">
+      <w:start w:val="1"/>
+      <w:numFmt w:val="bullet"/>
+      <w:lvlText w:val="o"/>
+      <w:lvlJc w:val="left"/>
+      <w:pPr>
+        <w:tabs>
+          <w:tab w:val="num" w:pos="1440"/>
+        </w:tabs>
+        <w:ind w:left="1440" w:hanging="360"/>
+      </w:pPr>
+      <w:rPr>
+        <w:rFonts w:ascii="Courier New" w:hAnsi="Courier New" w:hint="default"/>
+        <w:sz w:val="20"/>
+      </w:rPr>
+    </w:lvl>
+    <w:lvl w:ilvl="2" w:tentative="1">
+      <w:start w:val="1"/>
+      <w:numFmt w:val="decimal"/>
+      <w:lvlText w:val="%3."/>
+      <w:lvlJc w:val="left"/>
+      <w:pPr>
+        <w:tabs>
+          <w:tab w:val="num" w:pos="2160"/>
+        </w:tabs>
+        <w:ind w:left="2160" w:hanging="360"/>
+      </w:pPr>
+    </w:lvl>
+    <w:lvl w:ilvl="3" w:tentative="1">
+      <w:start w:val="1"/>
+      <w:numFmt w:val="decimal"/>
+      <w:lvlText w:val="%4."/>
+      <w:lvlJc w:val="left"/>
+      <w:pPr>
+        <w:tabs>
+          <w:tab w:val="num" w:pos="2880"/>
+        </w:tabs>
+        <w:ind w:left="2880" w:hanging="360"/>
+      </w:pPr>
+    </w:lvl>
+    <w:lvl w:ilvl="4" w:tentative="1">
+      <w:start w:val="1"/>
+      <w:numFmt w:val="decimal"/>
+      <w:lvlText w:val="%5."/>
+      <w:lvlJc w:val="left"/>
+      <w:pPr>
+        <w:tabs>
+          <w:tab w:val="num" w:pos="3600"/>
+        </w:tabs>
+        <w:ind w:left="3600" w:hanging="360"/>
+      </w:pPr>
+    </w:lvl>
+    <w:lvl w:ilvl="5" w:tentative="1">
+      <w:start w:val="1"/>
+      <w:numFmt w:val="decimal"/>
+      <w:lvlText w:val="%6."/>
+      <w:lvlJc w:val="left"/>
+      <w:pPr>
+        <w:tabs>
+          <w:tab w:val="num" w:pos="4320"/>
+        </w:tabs>
+        <w:ind w:left="4320" w:hanging="360"/>
+      </w:pPr>
+    </w:lvl>
+    <w:lvl w:ilvl="6" w:tentative="1">
+      <w:start w:val="1"/>
+      <w:numFmt w:val="decimal"/>
+      <w:lvlText w:val="%7."/>
+      <w:lvlJc w:val="left"/>
+      <w:pPr>
+        <w:tabs>
+          <w:tab w:val="num" w:pos="5040"/>
+        </w:tabs>
+        <w:ind w:left="5040" w:hanging="360"/>
+      </w:pPr>
+    </w:lvl>
+    <w:lvl w:ilvl="7" w:tentative="1">
+      <w:start w:val="1"/>
+      <w:numFmt w:val="decimal"/>
+      <w:lvlText w:val="%8."/>
+      <w:lvlJc w:val="left"/>
+      <w:pPr>
+        <w:tabs>
+          <w:tab w:val="num" w:pos="5760"/>
+        </w:tabs>
+        <w:ind w:left="5760" w:hanging="360"/>
+      </w:pPr>
+    </w:lvl>
+    <w:lvl w:ilvl="8" w:tentative="1">
+      <w:start w:val="1"/>
+      <w:numFmt w:val="decimal"/>
+      <w:lvlText w:val="%9."/>
+      <w:lvlJc w:val="left"/>
+      <w:pPr>
+        <w:tabs>
+          <w:tab w:val="num" w:pos="6480"/>
+        </w:tabs>
+        <w:ind w:left="6480" w:hanging="360"/>
+      </w:pPr>
+    </w:lvl>
+  </w:abstractNum>
+  <w:abstractNum w:abstractNumId="1" w15:restartNumberingAfterBreak="0">
     <w:nsid w:val="1E7F29A9"/>
     <w:multiLevelType w:val="multilevel"/>
     <w:tmpl w:val="EADC7D7C"/>
@@ -1248,7 +3102,7 @@
       </w:rPr>
     </w:lvl>
   </w:abstractNum>
-  <w:abstractNum w:abstractNumId="1" w15:restartNumberingAfterBreak="0">
+  <w:abstractNum w:abstractNumId="2" w15:restartNumberingAfterBreak="0">
     <w:nsid w:val="2CC11F71"/>
     <w:multiLevelType w:val="multilevel"/>
     <w:tmpl w:val="BD7E0AD2"/>
@@ -1397,7 +3251,233 @@
       </w:rPr>
     </w:lvl>
   </w:abstractNum>
-  <w:abstractNum w:abstractNumId="2" w15:restartNumberingAfterBreak="0">
+  <w:abstractNum w:abstractNumId="3" w15:restartNumberingAfterBreak="0">
+    <w:nsid w:val="2EFF2EF6"/>
+    <w:multiLevelType w:val="multilevel"/>
+    <w:tmpl w:val="B9929874"/>
+    <w:lvl w:ilvl="0">
+      <w:start w:val="5"/>
+      <w:numFmt w:val="decimal"/>
+      <w:lvlText w:val="%1."/>
+      <w:lvlJc w:val="left"/>
+      <w:pPr>
+        <w:tabs>
+          <w:tab w:val="num" w:pos="720"/>
+        </w:tabs>
+        <w:ind w:left="720" w:hanging="360"/>
+      </w:pPr>
+    </w:lvl>
+    <w:lvl w:ilvl="1" w:tentative="1">
+      <w:start w:val="1"/>
+      <w:numFmt w:val="decimal"/>
+      <w:lvlText w:val="%2."/>
+      <w:lvlJc w:val="left"/>
+      <w:pPr>
+        <w:tabs>
+          <w:tab w:val="num" w:pos="1440"/>
+        </w:tabs>
+        <w:ind w:left="1440" w:hanging="360"/>
+      </w:pPr>
+    </w:lvl>
+    <w:lvl w:ilvl="2" w:tentative="1">
+      <w:start w:val="1"/>
+      <w:numFmt w:val="decimal"/>
+      <w:lvlText w:val="%3."/>
+      <w:lvlJc w:val="left"/>
+      <w:pPr>
+        <w:tabs>
+          <w:tab w:val="num" w:pos="2160"/>
+        </w:tabs>
+        <w:ind w:left="2160" w:hanging="360"/>
+      </w:pPr>
+    </w:lvl>
+    <w:lvl w:ilvl="3" w:tentative="1">
+      <w:start w:val="1"/>
+      <w:numFmt w:val="decimal"/>
+      <w:lvlText w:val="%4."/>
+      <w:lvlJc w:val="left"/>
+      <w:pPr>
+        <w:tabs>
+          <w:tab w:val="num" w:pos="2880"/>
+        </w:tabs>
+        <w:ind w:left="2880" w:hanging="360"/>
+      </w:pPr>
+    </w:lvl>
+    <w:lvl w:ilvl="4" w:tentative="1">
+      <w:start w:val="1"/>
+      <w:numFmt w:val="decimal"/>
+      <w:lvlText w:val="%5."/>
+      <w:lvlJc w:val="left"/>
+      <w:pPr>
+        <w:tabs>
+          <w:tab w:val="num" w:pos="3600"/>
+        </w:tabs>
+        <w:ind w:left="3600" w:hanging="360"/>
+      </w:pPr>
+    </w:lvl>
+    <w:lvl w:ilvl="5" w:tentative="1">
+      <w:start w:val="1"/>
+      <w:numFmt w:val="decimal"/>
+      <w:lvlText w:val="%6."/>
+      <w:lvlJc w:val="left"/>
+      <w:pPr>
+        <w:tabs>
+          <w:tab w:val="num" w:pos="4320"/>
+        </w:tabs>
+        <w:ind w:left="4320" w:hanging="360"/>
+      </w:pPr>
+    </w:lvl>
+    <w:lvl w:ilvl="6" w:tentative="1">
+      <w:start w:val="1"/>
+      <w:numFmt w:val="decimal"/>
+      <w:lvlText w:val="%7."/>
+      <w:lvlJc w:val="left"/>
+      <w:pPr>
+        <w:tabs>
+          <w:tab w:val="num" w:pos="5040"/>
+        </w:tabs>
+        <w:ind w:left="5040" w:hanging="360"/>
+      </w:pPr>
+    </w:lvl>
+    <w:lvl w:ilvl="7" w:tentative="1">
+      <w:start w:val="1"/>
+      <w:numFmt w:val="decimal"/>
+      <w:lvlText w:val="%8."/>
+      <w:lvlJc w:val="left"/>
+      <w:pPr>
+        <w:tabs>
+          <w:tab w:val="num" w:pos="5760"/>
+        </w:tabs>
+        <w:ind w:left="5760" w:hanging="360"/>
+      </w:pPr>
+    </w:lvl>
+    <w:lvl w:ilvl="8" w:tentative="1">
+      <w:start w:val="1"/>
+      <w:numFmt w:val="decimal"/>
+      <w:lvlText w:val="%9."/>
+      <w:lvlJc w:val="left"/>
+      <w:pPr>
+        <w:tabs>
+          <w:tab w:val="num" w:pos="6480"/>
+        </w:tabs>
+        <w:ind w:left="6480" w:hanging="360"/>
+      </w:pPr>
+    </w:lvl>
+  </w:abstractNum>
+  <w:abstractNum w:abstractNumId="4" w15:restartNumberingAfterBreak="0">
+    <w:nsid w:val="578254B6"/>
+    <w:multiLevelType w:val="multilevel"/>
+    <w:tmpl w:val="31C494C0"/>
+    <w:lvl w:ilvl="0">
+      <w:start w:val="9"/>
+      <w:numFmt w:val="decimal"/>
+      <w:lvlText w:val="%1."/>
+      <w:lvlJc w:val="left"/>
+      <w:pPr>
+        <w:tabs>
+          <w:tab w:val="num" w:pos="720"/>
+        </w:tabs>
+        <w:ind w:left="720" w:hanging="360"/>
+      </w:pPr>
+    </w:lvl>
+    <w:lvl w:ilvl="1" w:tentative="1">
+      <w:start w:val="1"/>
+      <w:numFmt w:val="decimal"/>
+      <w:lvlText w:val="%2."/>
+      <w:lvlJc w:val="left"/>
+      <w:pPr>
+        <w:tabs>
+          <w:tab w:val="num" w:pos="1440"/>
+        </w:tabs>
+        <w:ind w:left="1440" w:hanging="360"/>
+      </w:pPr>
+    </w:lvl>
+    <w:lvl w:ilvl="2" w:tentative="1">
+      <w:start w:val="1"/>
+      <w:numFmt w:val="decimal"/>
+      <w:lvlText w:val="%3."/>
+      <w:lvlJc w:val="left"/>
+      <w:pPr>
+        <w:tabs>
+          <w:tab w:val="num" w:pos="2160"/>
+        </w:tabs>
+        <w:ind w:left="2160" w:hanging="360"/>
+      </w:pPr>
+    </w:lvl>
+    <w:lvl w:ilvl="3" w:tentative="1">
+      <w:start w:val="1"/>
+      <w:numFmt w:val="decimal"/>
+      <w:lvlText w:val="%4."/>
+      <w:lvlJc w:val="left"/>
+      <w:pPr>
+        <w:tabs>
+          <w:tab w:val="num" w:pos="2880"/>
+        </w:tabs>
+        <w:ind w:left="2880" w:hanging="360"/>
+      </w:pPr>
+    </w:lvl>
+    <w:lvl w:ilvl="4" w:tentative="1">
+      <w:start w:val="1"/>
+      <w:numFmt w:val="decimal"/>
+      <w:lvlText w:val="%5."/>
+      <w:lvlJc w:val="left"/>
+      <w:pPr>
+        <w:tabs>
+          <w:tab w:val="num" w:pos="3600"/>
+        </w:tabs>
+        <w:ind w:left="3600" w:hanging="360"/>
+      </w:pPr>
+    </w:lvl>
+    <w:lvl w:ilvl="5" w:tentative="1">
+      <w:start w:val="1"/>
+      <w:numFmt w:val="decimal"/>
+      <w:lvlText w:val="%6."/>
+      <w:lvlJc w:val="left"/>
+      <w:pPr>
+        <w:tabs>
+          <w:tab w:val="num" w:pos="4320"/>
+        </w:tabs>
+        <w:ind w:left="4320" w:hanging="360"/>
+      </w:pPr>
+    </w:lvl>
+    <w:lvl w:ilvl="6" w:tentative="1">
+      <w:start w:val="1"/>
+      <w:numFmt w:val="decimal"/>
+      <w:lvlText w:val="%7."/>
+      <w:lvlJc w:val="left"/>
+      <w:pPr>
+        <w:tabs>
+          <w:tab w:val="num" w:pos="5040"/>
+        </w:tabs>
+        <w:ind w:left="5040" w:hanging="360"/>
+      </w:pPr>
+    </w:lvl>
+    <w:lvl w:ilvl="7" w:tentative="1">
+      <w:start w:val="1"/>
+      <w:numFmt w:val="decimal"/>
+      <w:lvlText w:val="%8."/>
+      <w:lvlJc w:val="left"/>
+      <w:pPr>
+        <w:tabs>
+          <w:tab w:val="num" w:pos="5760"/>
+        </w:tabs>
+        <w:ind w:left="5760" w:hanging="360"/>
+      </w:pPr>
+    </w:lvl>
+    <w:lvl w:ilvl="8" w:tentative="1">
+      <w:start w:val="1"/>
+      <w:numFmt w:val="decimal"/>
+      <w:lvlText w:val="%9."/>
+      <w:lvlJc w:val="left"/>
+      <w:pPr>
+        <w:tabs>
+          <w:tab w:val="num" w:pos="6480"/>
+        </w:tabs>
+        <w:ind w:left="6480" w:hanging="360"/>
+      </w:pPr>
+    </w:lvl>
+  </w:abstractNum>
+  <w:abstractNum w:abstractNumId="5" w15:restartNumberingAfterBreak="0">
     <w:nsid w:val="5C2F327B"/>
     <w:multiLevelType w:val="hybridMultilevel"/>
     <w:tmpl w:val="97FE5902"/>
@@ -1486,7 +3566,120 @@
       </w:pPr>
     </w:lvl>
   </w:abstractNum>
-  <w:abstractNum w:abstractNumId="3" w15:restartNumberingAfterBreak="0">
+  <w:abstractNum w:abstractNumId="6" w15:restartNumberingAfterBreak="0">
+    <w:nsid w:val="652F0991"/>
+    <w:multiLevelType w:val="multilevel"/>
+    <w:tmpl w:val="86E20F30"/>
+    <w:lvl w:ilvl="0">
+      <w:start w:val="1"/>
+      <w:numFmt w:val="decimal"/>
+      <w:lvlText w:val="%1."/>
+      <w:lvlJc w:val="left"/>
+      <w:pPr>
+        <w:tabs>
+          <w:tab w:val="num" w:pos="720"/>
+        </w:tabs>
+        <w:ind w:left="720" w:hanging="360"/>
+      </w:pPr>
+    </w:lvl>
+    <w:lvl w:ilvl="1" w:tentative="1">
+      <w:start w:val="1"/>
+      <w:numFmt w:val="decimal"/>
+      <w:lvlText w:val="%2."/>
+      <w:lvlJc w:val="left"/>
+      <w:pPr>
+        <w:tabs>
+          <w:tab w:val="num" w:pos="1440"/>
+        </w:tabs>
+        <w:ind w:left="1440" w:hanging="360"/>
+      </w:pPr>
+    </w:lvl>
+    <w:lvl w:ilvl="2" w:tentative="1">
+      <w:start w:val="1"/>
+      <w:numFmt w:val="decimal"/>
+      <w:lvlText w:val="%3."/>
+      <w:lvlJc w:val="left"/>
+      <w:pPr>
+        <w:tabs>
+          <w:tab w:val="num" w:pos="2160"/>
+        </w:tabs>
+        <w:ind w:left="2160" w:hanging="360"/>
+      </w:pPr>
+    </w:lvl>
+    <w:lvl w:ilvl="3" w:tentative="1">
+      <w:start w:val="1"/>
+      <w:numFmt w:val="decimal"/>
+      <w:lvlText w:val="%4."/>
+      <w:lvlJc w:val="left"/>
+      <w:pPr>
+        <w:tabs>
+          <w:tab w:val="num" w:pos="2880"/>
+        </w:tabs>
+        <w:ind w:left="2880" w:hanging="360"/>
+      </w:pPr>
+    </w:lvl>
+    <w:lvl w:ilvl="4" w:tentative="1">
+      <w:start w:val="1"/>
+      <w:numFmt w:val="decimal"/>
+      <w:lvlText w:val="%5."/>
+      <w:lvlJc w:val="left"/>
+      <w:pPr>
+        <w:tabs>
+          <w:tab w:val="num" w:pos="3600"/>
+        </w:tabs>
+        <w:ind w:left="3600" w:hanging="360"/>
+      </w:pPr>
+    </w:lvl>
+    <w:lvl w:ilvl="5" w:tentative="1">
+      <w:start w:val="1"/>
+      <w:numFmt w:val="decimal"/>
+      <w:lvlText w:val="%6."/>
+      <w:lvlJc w:val="left"/>
+      <w:pPr>
+        <w:tabs>
+          <w:tab w:val="num" w:pos="4320"/>
+        </w:tabs>
+        <w:ind w:left="4320" w:hanging="360"/>
+      </w:pPr>
+    </w:lvl>
+    <w:lvl w:ilvl="6" w:tentative="1">
+      <w:start w:val="1"/>
+      <w:numFmt w:val="decimal"/>
+      <w:lvlText w:val="%7."/>
+      <w:lvlJc w:val="left"/>
+      <w:pPr>
+        <w:tabs>
+          <w:tab w:val="num" w:pos="5040"/>
+        </w:tabs>
+        <w:ind w:left="5040" w:hanging="360"/>
+      </w:pPr>
+    </w:lvl>
+    <w:lvl w:ilvl="7" w:tentative="1">
+      <w:start w:val="1"/>
+      <w:numFmt w:val="decimal"/>
+      <w:lvlText w:val="%8."/>
+      <w:lvlJc w:val="left"/>
+      <w:pPr>
+        <w:tabs>
+          <w:tab w:val="num" w:pos="5760"/>
+        </w:tabs>
+        <w:ind w:left="5760" w:hanging="360"/>
+      </w:pPr>
+    </w:lvl>
+    <w:lvl w:ilvl="8" w:tentative="1">
+      <w:start w:val="1"/>
+      <w:numFmt w:val="decimal"/>
+      <w:lvlText w:val="%9."/>
+      <w:lvlJc w:val="left"/>
+      <w:pPr>
+        <w:tabs>
+          <w:tab w:val="num" w:pos="6480"/>
+        </w:tabs>
+        <w:ind w:left="6480" w:hanging="360"/>
+      </w:pPr>
+    </w:lvl>
+  </w:abstractNum>
+  <w:abstractNum w:abstractNumId="7" w15:restartNumberingAfterBreak="0">
     <w:nsid w:val="7F89051C"/>
     <w:multiLevelType w:val="multilevel"/>
     <w:tmpl w:val="78D29736"/>
@@ -1636,16 +3829,28 @@
     </w:lvl>
   </w:abstractNum>
   <w:num w:numId="1" w16cid:durableId="1055927989">
-    <w:abstractNumId w:val="0"/>
+    <w:abstractNumId w:val="1"/>
   </w:num>
   <w:num w:numId="2" w16cid:durableId="858276935">
+    <w:abstractNumId w:val="7"/>
+  </w:num>
+  <w:num w:numId="3" w16cid:durableId="917980106">
+    <w:abstractNumId w:val="2"/>
+  </w:num>
+  <w:num w:numId="4" w16cid:durableId="1851216189">
+    <w:abstractNumId w:val="5"/>
+  </w:num>
+  <w:num w:numId="5" w16cid:durableId="2127193202">
+    <w:abstractNumId w:val="6"/>
+  </w:num>
+  <w:num w:numId="6" w16cid:durableId="295527949">
     <w:abstractNumId w:val="3"/>
   </w:num>
-  <w:num w:numId="3" w16cid:durableId="917980106">
-    <w:abstractNumId w:val="1"/>
+  <w:num w:numId="7" w16cid:durableId="122162086">
+    <w:abstractNumId w:val="4"/>
   </w:num>
-  <w:num w:numId="4" w16cid:durableId="1851216189">
-    <w:abstractNumId w:val="2"/>
+  <w:num w:numId="8" w16cid:durableId="1187328002">
+    <w:abstractNumId w:val="0"/>
   </w:num>
 </w:numbering>
 </file>
@@ -2252,7 +4457,6 @@
   <w:style w:type="character" w:default="1" w:styleId="Fuentedeprrafopredeter">
     <w:name w:val="Default Paragraph Font"/>
     <w:uiPriority w:val="1"/>
-    <w:semiHidden/>
     <w:unhideWhenUsed/>
   </w:style>
   <w:style w:type="table" w:default="1" w:styleId="Tablanormal">

</xml_diff>